<commit_message>
Add ACC claim follow-up dialogues and cases
</commit_message>
<xml_diff>
--- a/18_DOCX/ACC_FAQ_0031_0040.docx
+++ b/18_DOCX/ACC_FAQ_0031_0040.docx
@@ -1118,6 +1118,1080 @@
           <w:sz w:val="20"/>
         </w:rPr>
         <w:t>`02_MasterDictionary/ACC/ACC-0021.md`</w:t>
+      </w:r>
+    </w:p>
+    <w:p/>
+    <w:p>
+      <w:pPr>
+        <w:pStyle w:val="Heading2"/>
+      </w:pPr>
+      <w:r>
+        <w:rPr>
+          <w:rFonts w:ascii="Noto Sans CJK JP" w:hAnsi="Noto Sans CJK JP" w:eastAsia="Noto Sans CJK JP"/>
+          <w:b/>
+          <w:color w:val="2F5496"/>
+          <w:sz w:val="28"/>
+        </w:rPr>
+        <w:t>改訂履歴</w:t>
+      </w:r>
+    </w:p>
+    <w:p/>
+    <w:tbl>
+      <w:tblPr>
+        <w:tblStyle w:val="TableGrid"/>
+        <w:tblW w:type="auto" w:w="0"/>
+        <w:tblLook w:firstColumn="1" w:firstRow="1" w:lastColumn="0" w:lastRow="0" w:noHBand="0" w:noVBand="1" w:val="04A0"/>
+      </w:tblPr>
+      <w:tblGrid>
+        <w:gridCol w:w="2556"/>
+        <w:gridCol w:w="2556"/>
+        <w:gridCol w:w="2556"/>
+        <w:gridCol w:w="2556"/>
+      </w:tblGrid>
+      <w:tr>
+        <w:tc>
+          <w:tcPr>
+            <w:tcW w:type="dxa" w:w="2556"/>
+          </w:tcPr>
+          <w:p>
+            <w:r/>
+            <w:r>
+              <w:rPr>
+                <w:rFonts w:ascii="Noto Sans CJK JP" w:hAnsi="Noto Sans CJK JP" w:eastAsia="Noto Sans CJK JP"/>
+                <w:b/>
+                <w:sz w:val="18"/>
+              </w:rPr>
+              <w:t>Data</w:t>
+            </w:r>
+          </w:p>
+        </w:tc>
+        <w:tc>
+          <w:tcPr>
+            <w:tcW w:type="dxa" w:w="2556"/>
+          </w:tcPr>
+          <w:p>
+            <w:r/>
+            <w:r>
+              <w:rPr>
+                <w:rFonts w:ascii="Noto Sans CJK JP" w:hAnsi="Noto Sans CJK JP" w:eastAsia="Noto Sans CJK JP"/>
+                <w:b/>
+                <w:sz w:val="18"/>
+              </w:rPr>
+              <w:t>Versão</w:t>
+            </w:r>
+          </w:p>
+        </w:tc>
+        <w:tc>
+          <w:tcPr>
+            <w:tcW w:type="dxa" w:w="2556"/>
+          </w:tcPr>
+          <w:p>
+            <w:r/>
+            <w:r>
+              <w:rPr>
+                <w:rFonts w:ascii="Noto Sans CJK JP" w:hAnsi="Noto Sans CJK JP" w:eastAsia="Noto Sans CJK JP"/>
+                <w:b/>
+                <w:sz w:val="18"/>
+              </w:rPr>
+              <w:t>Autor</w:t>
+            </w:r>
+          </w:p>
+        </w:tc>
+        <w:tc>
+          <w:tcPr>
+            <w:tcW w:type="dxa" w:w="2556"/>
+          </w:tcPr>
+          <w:p>
+            <w:r/>
+            <w:r>
+              <w:rPr>
+                <w:rFonts w:ascii="Noto Sans CJK JP" w:hAnsi="Noto Sans CJK JP" w:eastAsia="Noto Sans CJK JP"/>
+                <w:b/>
+                <w:sz w:val="18"/>
+              </w:rPr>
+              <w:t>Alteração</w:t>
+            </w:r>
+          </w:p>
+        </w:tc>
+      </w:tr>
+      <w:tr>
+        <w:tc>
+          <w:tcPr>
+            <w:tcW w:type="dxa" w:w="2556"/>
+          </w:tcPr>
+          <w:p>
+            <w:r/>
+            <w:r>
+              <w:rPr>
+                <w:rFonts w:ascii="Noto Sans CJK JP" w:hAnsi="Noto Sans CJK JP" w:eastAsia="Noto Sans CJK JP"/>
+                <w:b w:val="0"/>
+                <w:sz w:val="18"/>
+              </w:rPr>
+              <w:t>2026-07-03</w:t>
+            </w:r>
+          </w:p>
+        </w:tc>
+        <w:tc>
+          <w:tcPr>
+            <w:tcW w:type="dxa" w:w="2556"/>
+          </w:tcPr>
+          <w:p>
+            <w:r/>
+            <w:r>
+              <w:rPr>
+                <w:rFonts w:ascii="Noto Sans CJK JP" w:hAnsi="Noto Sans CJK JP" w:eastAsia="Noto Sans CJK JP"/>
+                <w:b w:val="0"/>
+                <w:sz w:val="18"/>
+              </w:rPr>
+              <w:t>0.2</w:t>
+            </w:r>
+          </w:p>
+        </w:tc>
+        <w:tc>
+          <w:tcPr>
+            <w:tcW w:type="dxa" w:w="2556"/>
+          </w:tcPr>
+          <w:p>
+            <w:r/>
+            <w:r>
+              <w:rPr>
+                <w:rFonts w:ascii="Noto Sans CJK JP" w:hAnsi="Noto Sans CJK JP" w:eastAsia="Noto Sans CJK JP"/>
+                <w:b w:val="0"/>
+                <w:sz w:val="18"/>
+              </w:rPr>
+              <w:t>JP-BR Insurance Knowledge Base</w:t>
+            </w:r>
+          </w:p>
+        </w:tc>
+        <w:tc>
+          <w:tcPr>
+            <w:tcW w:type="dxa" w:w="2556"/>
+          </w:tcPr>
+          <w:p>
+            <w:r/>
+            <w:r>
+              <w:rPr>
+                <w:rFonts w:ascii="Noto Sans CJK JP" w:hAnsi="Noto Sans CJK JP" w:eastAsia="Noto Sans CJK JP"/>
+                <w:b w:val="0"/>
+                <w:sz w:val="18"/>
+              </w:rPr>
+              <w:t>Ajuste de compliance na resposta ao cliente para condicionar atraso bancário à aprovação do pagamento.</w:t>
+            </w:r>
+          </w:p>
+        </w:tc>
+      </w:tr>
+      <w:tr>
+        <w:tc>
+          <w:tcPr>
+            <w:tcW w:type="dxa" w:w="2556"/>
+          </w:tcPr>
+          <w:p>
+            <w:r/>
+            <w:r>
+              <w:rPr>
+                <w:rFonts w:ascii="Noto Sans CJK JP" w:hAnsi="Noto Sans CJK JP" w:eastAsia="Noto Sans CJK JP"/>
+                <w:b w:val="0"/>
+                <w:sz w:val="18"/>
+              </w:rPr>
+              <w:t>2026-06-30</w:t>
+            </w:r>
+          </w:p>
+        </w:tc>
+        <w:tc>
+          <w:tcPr>
+            <w:tcW w:type="dxa" w:w="2556"/>
+          </w:tcPr>
+          <w:p>
+            <w:r/>
+            <w:r>
+              <w:rPr>
+                <w:rFonts w:ascii="Noto Sans CJK JP" w:hAnsi="Noto Sans CJK JP" w:eastAsia="Noto Sans CJK JP"/>
+                <w:b w:val="0"/>
+                <w:sz w:val="18"/>
+              </w:rPr>
+              <w:t>0.1</w:t>
+            </w:r>
+          </w:p>
+        </w:tc>
+        <w:tc>
+          <w:tcPr>
+            <w:tcW w:type="dxa" w:w="2556"/>
+          </w:tcPr>
+          <w:p>
+            <w:r/>
+            <w:r>
+              <w:rPr>
+                <w:rFonts w:ascii="Noto Sans CJK JP" w:hAnsi="Noto Sans CJK JP" w:eastAsia="Noto Sans CJK JP"/>
+                <w:b w:val="0"/>
+                <w:sz w:val="18"/>
+              </w:rPr>
+              <w:t>JP-BR Insurance Knowledge Base</w:t>
+            </w:r>
+          </w:p>
+        </w:tc>
+        <w:tc>
+          <w:tcPr>
+            <w:tcW w:type="dxa" w:w="2556"/>
+          </w:tcPr>
+          <w:p>
+            <w:r/>
+            <w:r>
+              <w:rPr>
+                <w:rFonts w:ascii="Noto Sans CJK JP" w:hAnsi="Noto Sans CJK JP" w:eastAsia="Noto Sans CJK JP"/>
+                <w:b w:val="0"/>
+                <w:sz w:val="18"/>
+              </w:rPr>
+              <w:t>Criação inicial.</w:t>
+            </w:r>
+          </w:p>
+        </w:tc>
+      </w:tr>
+    </w:tbl>
+    <w:p/>
+    <w:p>
+      <w:r>
+        <w:br w:type="page"/>
+      </w:r>
+    </w:p>
+    <w:p/>
+    <w:p>
+      <w:pPr>
+        <w:pStyle w:val="Heading1"/>
+      </w:pPr>
+      <w:r>
+        <w:rPr>
+          <w:rFonts w:ascii="Noto Sans CJK JP" w:hAnsi="Noto Sans CJK JP" w:eastAsia="Noto Sans CJK JP"/>
+          <w:b/>
+          <w:color w:val="1F4E79"/>
+          <w:sz w:val="36"/>
+        </w:rPr>
+        <w:t>FAQ-ACC-0032 - 支払われないと言われた場合はどうしますか。</w:t>
+      </w:r>
+    </w:p>
+    <w:p/>
+    <w:p>
+      <w:pPr>
+        <w:pStyle w:val="Heading2"/>
+      </w:pPr>
+      <w:r>
+        <w:rPr>
+          <w:rFonts w:ascii="Noto Sans CJK JP" w:hAnsi="Noto Sans CJK JP" w:eastAsia="Noto Sans CJK JP"/>
+          <w:b/>
+          <w:color w:val="2F5496"/>
+          <w:sz w:val="28"/>
+        </w:rPr>
+        <w:t>管理情報</w:t>
+      </w:r>
+    </w:p>
+    <w:p/>
+    <w:p>
+      <w:pPr>
+        <w:pStyle w:val="ListBullet"/>
+      </w:pPr>
+      <w:r>
+        <w:rPr>
+          <w:rFonts w:ascii="Noto Sans CJK JP" w:hAnsi="Noto Sans CJK JP" w:eastAsia="Noto Sans CJK JP"/>
+          <w:sz w:val="20"/>
+        </w:rPr>
+        <w:t>Versão: 0.1</w:t>
+      </w:r>
+    </w:p>
+    <w:p>
+      <w:pPr>
+        <w:pStyle w:val="ListBullet"/>
+      </w:pPr>
+      <w:r>
+        <w:rPr>
+          <w:rFonts w:ascii="Noto Sans CJK JP" w:hAnsi="Noto Sans CJK JP" w:eastAsia="Noto Sans CJK JP"/>
+          <w:sz w:val="20"/>
+        </w:rPr>
+        <w:t>Data: 2026-06-30</w:t>
+      </w:r>
+    </w:p>
+    <w:p>
+      <w:pPr>
+        <w:pStyle w:val="ListBullet"/>
+      </w:pPr>
+      <w:r>
+        <w:rPr>
+          <w:rFonts w:ascii="Noto Sans CJK JP" w:hAnsi="Noto Sans CJK JP" w:eastAsia="Noto Sans CJK JP"/>
+          <w:sz w:val="20"/>
+        </w:rPr>
+        <w:t>Autor: JP-BR Insurance Knowledge Base</w:t>
+      </w:r>
+    </w:p>
+    <w:p>
+      <w:pPr>
+        <w:pStyle w:val="ListBullet"/>
+      </w:pPr>
+      <w:r>
+        <w:rPr>
+          <w:rFonts w:ascii="Noto Sans CJK JP" w:hAnsi="Noto Sans CJK JP" w:eastAsia="Noto Sans CJK JP"/>
+          <w:sz w:val="20"/>
+        </w:rPr>
+        <w:t>Histórico: Criação inicial do quinto lote ACC, com foco em acompanhamento de sinistro e comunicação segura.</w:t>
+      </w:r>
+    </w:p>
+    <w:p/>
+    <w:p>
+      <w:pPr>
+        <w:pStyle w:val="Heading2"/>
+      </w:pPr>
+      <w:r>
+        <w:rPr>
+          <w:rFonts w:ascii="Noto Sans CJK JP" w:hAnsi="Noto Sans CJK JP" w:eastAsia="Noto Sans CJK JP"/>
+          <w:b/>
+          <w:color w:val="2F5496"/>
+          <w:sz w:val="28"/>
+        </w:rPr>
+        <w:t>コード</w:t>
+      </w:r>
+    </w:p>
+    <w:p/>
+    <w:p>
+      <w:r>
+        <w:rPr>
+          <w:rFonts w:ascii="Noto Sans CJK JP" w:hAnsi="Noto Sans CJK JP" w:eastAsia="Noto Sans CJK JP"/>
+          <w:sz w:val="21"/>
+        </w:rPr>
+        <w:t>FAQ-ACC-0032</w:t>
+      </w:r>
+    </w:p>
+    <w:p/>
+    <w:p>
+      <w:pPr>
+        <w:pStyle w:val="Heading2"/>
+      </w:pPr>
+      <w:r>
+        <w:rPr>
+          <w:rFonts w:ascii="Noto Sans CJK JP" w:hAnsi="Noto Sans CJK JP" w:eastAsia="Noto Sans CJK JP"/>
+          <w:b/>
+          <w:color w:val="2F5496"/>
+          <w:sz w:val="28"/>
+        </w:rPr>
+        <w:t>カテゴリー</w:t>
+      </w:r>
+    </w:p>
+    <w:p/>
+    <w:p>
+      <w:r>
+        <w:rPr>
+          <w:rFonts w:ascii="Noto Sans CJK JP" w:hAnsi="Noto Sans CJK JP" w:eastAsia="Noto Sans CJK JP"/>
+          <w:sz w:val="21"/>
+        </w:rPr>
+        <w:t>ACC</w:t>
+      </w:r>
+    </w:p>
+    <w:p/>
+    <w:p>
+      <w:pPr>
+        <w:pStyle w:val="Heading2"/>
+      </w:pPr>
+      <w:r>
+        <w:rPr>
+          <w:rFonts w:ascii="Noto Sans CJK JP" w:hAnsi="Noto Sans CJK JP" w:eastAsia="Noto Sans CJK JP"/>
+          <w:b/>
+          <w:color w:val="2F5496"/>
+          <w:sz w:val="28"/>
+        </w:rPr>
+        <w:t>質問</w:t>
+      </w:r>
+    </w:p>
+    <w:p/>
+    <w:p>
+      <w:r>
+        <w:rPr>
+          <w:rFonts w:ascii="Noto Sans CJK JP" w:hAnsi="Noto Sans CJK JP" w:eastAsia="Noto Sans CJK JP"/>
+          <w:sz w:val="21"/>
+        </w:rPr>
+        <w:t>支払われないと言われた場合はどうしますか。</w:t>
+      </w:r>
+    </w:p>
+    <w:p/>
+    <w:p>
+      <w:pPr>
+        <w:pStyle w:val="Heading2"/>
+      </w:pPr>
+      <w:r>
+        <w:rPr>
+          <w:rFonts w:ascii="Noto Sans CJK JP" w:hAnsi="Noto Sans CJK JP" w:eastAsia="Noto Sans CJK JP"/>
+          <w:b/>
+          <w:color w:val="2F5496"/>
+          <w:sz w:val="28"/>
+        </w:rPr>
+        <w:t>日本語での自然な検索</w:t>
+      </w:r>
+    </w:p>
+    <w:p/>
+    <w:p>
+      <w:pPr>
+        <w:pStyle w:val="ListBullet"/>
+      </w:pPr>
+      <w:r>
+        <w:rPr>
+          <w:rFonts w:ascii="Noto Sans CJK JP" w:hAnsi="Noto Sans CJK JP" w:eastAsia="Noto Sans CJK JP"/>
+          <w:sz w:val="20"/>
+        </w:rPr>
+        <w:t>支払われないと言われた場合はどうしますか。</w:t>
+      </w:r>
+    </w:p>
+    <w:p>
+      <w:pPr>
+        <w:pStyle w:val="ListBullet"/>
+      </w:pPr>
+      <w:r>
+        <w:rPr>
+          <w:rFonts w:ascii="Noto Sans CJK JP" w:hAnsi="Noto Sans CJK JP" w:eastAsia="Noto Sans CJK JP"/>
+          <w:sz w:val="20"/>
+        </w:rPr>
+        <w:t>ブラジル人のお客様にこの事故対応をどう説明しますか。</w:t>
+      </w:r>
+    </w:p>
+    <w:p>
+      <w:pPr>
+        <w:pStyle w:val="ListBullet"/>
+      </w:pPr>
+      <w:r>
+        <w:rPr>
+          <w:rFonts w:ascii="Noto Sans CJK JP" w:hAnsi="Noto Sans CJK JP" w:eastAsia="Noto Sans CJK JP"/>
+          <w:sz w:val="20"/>
+        </w:rPr>
+        <w:t>保険会社の正式案内を待つ説明を確認したいです。</w:t>
+      </w:r>
+    </w:p>
+    <w:p/>
+    <w:p>
+      <w:pPr>
+        <w:pStyle w:val="Heading2"/>
+      </w:pPr>
+      <w:r>
+        <w:rPr>
+          <w:rFonts w:ascii="Noto Sans CJK JP" w:hAnsi="Noto Sans CJK JP" w:eastAsia="Noto Sans CJK JP"/>
+          <w:b/>
+          <w:color w:val="2F5496"/>
+          <w:sz w:val="28"/>
+        </w:rPr>
+        <w:t>対応場面</w:t>
+      </w:r>
+    </w:p>
+    <w:p/>
+    <w:p>
+      <w:r>
+        <w:rPr>
+          <w:rFonts w:ascii="Noto Sans CJK JP" w:hAnsi="Noto Sans CJK JP" w:eastAsia="Noto Sans CJK JP"/>
+          <w:sz w:val="21"/>
+        </w:rPr>
+        <w:t>顧客が不支払の案内を受けて理由を確認したい場面。</w:t>
+      </w:r>
+    </w:p>
+    <w:p/>
+    <w:p>
+      <w:pPr>
+        <w:pStyle w:val="Heading2"/>
+      </w:pPr>
+      <w:r>
+        <w:rPr>
+          <w:rFonts w:ascii="Noto Sans CJK JP" w:hAnsi="Noto Sans CJK JP" w:eastAsia="Noto Sans CJK JP"/>
+          <w:b/>
+          <w:color w:val="2F5496"/>
+          <w:sz w:val="28"/>
+        </w:rPr>
+        <w:t>技術的回答</w:t>
+      </w:r>
+    </w:p>
+    <w:p/>
+    <w:p>
+      <w:r>
+        <w:rPr>
+          <w:rFonts w:ascii="Noto Sans CJK JP" w:hAnsi="Noto Sans CJK JP" w:eastAsia="Noto Sans CJK JP"/>
+          <w:sz w:val="21"/>
+        </w:rPr>
+        <w:t>保険会社が契約条件、免責事由、書類、事故状況などを確認した結果、支払い対象外と判断したことを通知する案内です。</w:t>
+      </w:r>
+    </w:p>
+    <w:p/>
+    <w:p>
+      <w:pPr>
+        <w:pStyle w:val="Heading2"/>
+      </w:pPr>
+      <w:r>
+        <w:rPr>
+          <w:rFonts w:ascii="Noto Sans CJK JP" w:hAnsi="Noto Sans CJK JP" w:eastAsia="Noto Sans CJK JP"/>
+          <w:b/>
+          <w:color w:val="2F5496"/>
+          <w:sz w:val="28"/>
+        </w:rPr>
+        <w:t>ブラジル人顧客への回答</w:t>
+      </w:r>
+    </w:p>
+    <w:p/>
+    <w:p>
+      <w:pPr>
+        <w:pStyle w:val="Heading3"/>
+      </w:pPr>
+      <w:r>
+        <w:rPr>
+          <w:rFonts w:ascii="Noto Sans CJK JP" w:hAnsi="Noto Sans CJK JP" w:eastAsia="Noto Sans CJK JP"/>
+          <w:b/>
+          <w:color w:val="595959"/>
+          <w:sz w:val="24"/>
+        </w:rPr>
+        <w:t>ポルトガル語で伝える内容</w:t>
+      </w:r>
+    </w:p>
+    <w:p/>
+    <w:p>
+      <w:r>
+        <w:rPr>
+          <w:rFonts w:ascii="Noto Sans CJK JP" w:hAnsi="Noto Sans CJK JP" w:eastAsia="Noto Sans CJK JP"/>
+          <w:sz w:val="21"/>
+        </w:rPr>
+        <w:t>Se a seguradora não aprovar o pagamento, precisamos verificar o motivo indicado oficialmente.</w:t>
+      </w:r>
+    </w:p>
+    <w:p/>
+    <w:p>
+      <w:pPr>
+        <w:pStyle w:val="Heading3"/>
+      </w:pPr>
+      <w:r>
+        <w:rPr>
+          <w:rFonts w:ascii="Noto Sans CJK JP" w:hAnsi="Noto Sans CJK JP" w:eastAsia="Noto Sans CJK JP"/>
+          <w:b/>
+          <w:color w:val="595959"/>
+          <w:sz w:val="24"/>
+        </w:rPr>
+        <w:t>カタカナ読み</w:t>
+      </w:r>
+    </w:p>
+    <w:p/>
+    <w:p>
+      <w:r>
+        <w:rPr>
+          <w:rFonts w:ascii="Noto Sans CJK JP" w:hAnsi="Noto Sans CJK JP" w:eastAsia="Noto Sans CJK JP"/>
+          <w:sz w:val="21"/>
+        </w:rPr>
+        <w:t>セ ア セグラドーラ ナォン アプロヴァール オ パガメント、プレシザモス ヴェリフィカール オ モチーヴォ インジカード オフィシアウメンチ</w:t>
+      </w:r>
+    </w:p>
+    <w:p/>
+    <w:p>
+      <w:r>
+        <w:rPr>
+          <w:rFonts w:ascii="Noto Sans CJK JP" w:hAnsi="Noto Sans CJK JP" w:eastAsia="Noto Sans CJK JP"/>
+          <w:sz w:val="21"/>
+        </w:rPr>
+        <w:t>日本語確認用: 不支払理由は正式通知で確認する。</w:t>
+      </w:r>
+    </w:p>
+    <w:p/>
+    <w:p>
+      <w:pPr>
+        <w:pStyle w:val="Heading2"/>
+      </w:pPr>
+      <w:r>
+        <w:rPr>
+          <w:rFonts w:ascii="Noto Sans CJK JP" w:hAnsi="Noto Sans CJK JP" w:eastAsia="Noto Sans CJK JP"/>
+          <w:b/>
+          <w:color w:val="2F5496"/>
+          <w:sz w:val="28"/>
+        </w:rPr>
+        <w:t>顧客への次の一言</w:t>
+      </w:r>
+    </w:p>
+    <w:p/>
+    <w:p>
+      <w:pPr>
+        <w:pStyle w:val="Heading3"/>
+      </w:pPr>
+      <w:r>
+        <w:rPr>
+          <w:rFonts w:ascii="Noto Sans CJK JP" w:hAnsi="Noto Sans CJK JP" w:eastAsia="Noto Sans CJK JP"/>
+          <w:b/>
+          <w:color w:val="595959"/>
+          <w:sz w:val="24"/>
+        </w:rPr>
+        <w:t>ポルトガル語で伝える内容</w:t>
+      </w:r>
+    </w:p>
+    <w:p/>
+    <w:p>
+      <w:r>
+        <w:rPr>
+          <w:rFonts w:ascii="Noto Sans CJK JP" w:hAnsi="Noto Sans CJK JP" w:eastAsia="Noto Sans CJK JP"/>
+          <w:sz w:val="21"/>
+        </w:rPr>
+        <w:t>Vou confirmar a orientação oficial da seguradora antes de responder com segurança.</w:t>
+      </w:r>
+    </w:p>
+    <w:p/>
+    <w:p>
+      <w:pPr>
+        <w:pStyle w:val="Heading3"/>
+      </w:pPr>
+      <w:r>
+        <w:rPr>
+          <w:rFonts w:ascii="Noto Sans CJK JP" w:hAnsi="Noto Sans CJK JP" w:eastAsia="Noto Sans CJK JP"/>
+          <w:b/>
+          <w:color w:val="595959"/>
+          <w:sz w:val="24"/>
+        </w:rPr>
+        <w:t>カタカナ読み</w:t>
+      </w:r>
+    </w:p>
+    <w:p/>
+    <w:p>
+      <w:r>
+        <w:rPr>
+          <w:rFonts w:ascii="Noto Sans CJK JP" w:hAnsi="Noto Sans CJK JP" w:eastAsia="Noto Sans CJK JP"/>
+          <w:sz w:val="21"/>
+        </w:rPr>
+        <w:t>ヴォウ コンフィルマール ア オリエンタサォン オフィシアウ ダ セグラドーラ アンチス ジ ヘスポンデール コン セグランサ</w:t>
+      </w:r>
+    </w:p>
+    <w:p/>
+    <w:p>
+      <w:r>
+        <w:rPr>
+          <w:rFonts w:ascii="Noto Sans CJK JP" w:hAnsi="Noto Sans CJK JP" w:eastAsia="Noto Sans CJK JP"/>
+          <w:sz w:val="21"/>
+        </w:rPr>
+        <w:t>日本語確認用: 断定せず、保険会社の正式案内を確認してから回答する。</w:t>
+      </w:r>
+    </w:p>
+    <w:p/>
+    <w:p>
+      <w:pPr>
+        <w:pStyle w:val="Heading2"/>
+      </w:pPr>
+      <w:r>
+        <w:rPr>
+          <w:rFonts w:ascii="Noto Sans CJK JP" w:hAnsi="Noto Sans CJK JP" w:eastAsia="Noto Sans CJK JP"/>
+          <w:b/>
+          <w:color w:val="2F5496"/>
+          <w:sz w:val="28"/>
+        </w:rPr>
+        <w:t>想定される反論</w:t>
+      </w:r>
+    </w:p>
+    <w:p/>
+    <w:p>
+      <w:pPr>
+        <w:pStyle w:val="Heading3"/>
+      </w:pPr>
+      <w:r>
+        <w:rPr>
+          <w:rFonts w:ascii="Noto Sans CJK JP" w:hAnsi="Noto Sans CJK JP" w:eastAsia="Noto Sans CJK JP"/>
+          <w:b/>
+          <w:color w:val="595959"/>
+          <w:sz w:val="24"/>
+        </w:rPr>
+        <w:t>顧客が言いそうなこと</w:t>
+      </w:r>
+    </w:p>
+    <w:p/>
+    <w:p>
+      <w:r>
+        <w:rPr>
+          <w:rFonts w:ascii="Noto Sans CJK JP" w:hAnsi="Noto Sans CJK JP" w:eastAsia="Noto Sans CJK JP"/>
+          <w:sz w:val="21"/>
+        </w:rPr>
+        <w:t>Mas eu preciso de uma resposta agora.</w:t>
+      </w:r>
+    </w:p>
+    <w:p/>
+    <w:p>
+      <w:pPr>
+        <w:pStyle w:val="Heading3"/>
+      </w:pPr>
+      <w:r>
+        <w:rPr>
+          <w:rFonts w:ascii="Noto Sans CJK JP" w:hAnsi="Noto Sans CJK JP" w:eastAsia="Noto Sans CJK JP"/>
+          <w:b/>
+          <w:color w:val="595959"/>
+          <w:sz w:val="24"/>
+        </w:rPr>
+        <w:t>安全なポルトガル語回答</w:t>
+      </w:r>
+    </w:p>
+    <w:p/>
+    <w:p>
+      <w:r>
+        <w:rPr>
+          <w:rFonts w:ascii="Noto Sans CJK JP" w:hAnsi="Noto Sans CJK JP" w:eastAsia="Noto Sans CJK JP"/>
+          <w:sz w:val="21"/>
+        </w:rPr>
+        <w:t>Entendo. Para evitar uma informação errada, preciso confirmar com a seguradora antes de responder.</w:t>
+      </w:r>
+    </w:p>
+    <w:p/>
+    <w:p>
+      <w:pPr>
+        <w:pStyle w:val="Heading2"/>
+      </w:pPr>
+      <w:r>
+        <w:rPr>
+          <w:rFonts w:ascii="Noto Sans CJK JP" w:hAnsi="Noto Sans CJK JP" w:eastAsia="Noto Sans CJK JP"/>
+          <w:b/>
+          <w:color w:val="2F5496"/>
+          <w:sz w:val="28"/>
+        </w:rPr>
+        <w:t>安全な次のステップ</w:t>
+      </w:r>
+    </w:p>
+    <w:p/>
+    <w:p>
+      <w:r>
+        <w:rPr>
+          <w:rFonts w:ascii="Noto Sans CJK JP" w:hAnsi="Noto Sans CJK JP" w:eastAsia="Noto Sans CJK JP"/>
+          <w:sz w:val="21"/>
+        </w:rPr>
+        <w:t>保険証券、事故状況、提出書類、保険会社からの通知、追加依頼の有無を確認する。</w:t>
+      </w:r>
+    </w:p>
+    <w:p/>
+    <w:p>
+      <w:pPr>
+        <w:pStyle w:val="Heading2"/>
+      </w:pPr>
+      <w:r>
+        <w:rPr>
+          <w:rFonts w:ascii="Noto Sans CJK JP" w:hAnsi="Noto Sans CJK JP" w:eastAsia="Noto Sans CJK JP"/>
+          <w:b/>
+          <w:color w:val="2F5496"/>
+          <w:sz w:val="28"/>
+        </w:rPr>
+        <w:t>コンプライアンス上の注意</w:t>
+      </w:r>
+    </w:p>
+    <w:p/>
+    <w:p>
+      <w:r>
+        <w:rPr>
+          <w:rFonts w:ascii="Noto Sans CJK JP" w:hAnsi="Noto Sans CJK JP" w:eastAsia="Noto Sans CJK JP"/>
+          <w:sz w:val="21"/>
+        </w:rPr>
+        <w:t>このFAQは受付と説明の補助であり、支払可否、支払金額、支払時期、補償、免責該当性、受取可否を断定しない。最終判断は契約条件、事故状況、提出書類、公的制度および保険会社の査定による。</w:t>
+      </w:r>
+    </w:p>
+    <w:p/>
+    <w:p>
+      <w:pPr>
+        <w:pStyle w:val="Heading2"/>
+      </w:pPr>
+      <w:r>
+        <w:rPr>
+          <w:rFonts w:ascii="Noto Sans CJK JP" w:hAnsi="Noto Sans CJK JP" w:eastAsia="Noto Sans CJK JP"/>
+          <w:b/>
+          <w:color w:val="2F5496"/>
+          <w:sz w:val="28"/>
+        </w:rPr>
+        <w:t>関連用語</w:t>
+      </w:r>
+    </w:p>
+    <w:p/>
+    <w:p>
+      <w:pPr>
+        <w:pStyle w:val="ListBullet"/>
+      </w:pPr>
+      <w:r>
+        <w:rPr>
+          <w:rFonts w:ascii="Noto Sans CJK JP" w:hAnsi="Noto Sans CJK JP" w:eastAsia="Noto Sans CJK JP"/>
+          <w:sz w:val="20"/>
+        </w:rPr>
+        <w:t>ACC-0032</w:t>
+      </w:r>
+    </w:p>
+    <w:p>
+      <w:pPr>
+        <w:pStyle w:val="ListBullet"/>
+      </w:pPr>
+      <w:r>
+        <w:rPr>
+          <w:rFonts w:ascii="Noto Sans CJK JP" w:hAnsi="Noto Sans CJK JP" w:eastAsia="Noto Sans CJK JP"/>
+          <w:sz w:val="20"/>
+        </w:rPr>
+        <w:t>ACC-0010</w:t>
+      </w:r>
+    </w:p>
+    <w:p>
+      <w:pPr>
+        <w:pStyle w:val="ListBullet"/>
+      </w:pPr>
+      <w:r>
+        <w:rPr>
+          <w:rFonts w:ascii="Noto Sans CJK JP" w:hAnsi="Noto Sans CJK JP" w:eastAsia="Noto Sans CJK JP"/>
+          <w:sz w:val="20"/>
+        </w:rPr>
+        <w:t>ACC-0030</w:t>
+      </w:r>
+    </w:p>
+    <w:p>
+      <w:pPr>
+        <w:pStyle w:val="ListBullet"/>
+      </w:pPr>
+      <w:r>
+        <w:rPr>
+          <w:rFonts w:ascii="Noto Sans CJK JP" w:hAnsi="Noto Sans CJK JP" w:eastAsia="Noto Sans CJK JP"/>
+          <w:sz w:val="20"/>
+        </w:rPr>
+        <w:t>ACC-0031</w:t>
+      </w:r>
+    </w:p>
+    <w:p/>
+    <w:p>
+      <w:pPr>
+        <w:pStyle w:val="Heading2"/>
+      </w:pPr>
+      <w:r>
+        <w:rPr>
+          <w:rFonts w:ascii="Noto Sans CJK JP" w:hAnsi="Noto Sans CJK JP" w:eastAsia="Noto Sans CJK JP"/>
+          <w:b/>
+          <w:color w:val="2F5496"/>
+          <w:sz w:val="28"/>
+        </w:rPr>
+        <w:t>相互参照</w:t>
+      </w:r>
+    </w:p>
+    <w:p/>
+    <w:p>
+      <w:pPr>
+        <w:pStyle w:val="ListBullet"/>
+      </w:pPr>
+      <w:r>
+        <w:rPr>
+          <w:rFonts w:ascii="Noto Sans CJK JP" w:hAnsi="Noto Sans CJK JP" w:eastAsia="Noto Sans CJK JP"/>
+          <w:sz w:val="20"/>
+        </w:rPr>
+        <w:t>ACC-0032</w:t>
+      </w:r>
+    </w:p>
+    <w:p>
+      <w:pPr>
+        <w:pStyle w:val="ListBullet"/>
+      </w:pPr>
+      <w:r>
+        <w:rPr>
+          <w:rFonts w:ascii="Noto Sans CJK JP" w:hAnsi="Noto Sans CJK JP" w:eastAsia="Noto Sans CJK JP"/>
+          <w:sz w:val="20"/>
+        </w:rPr>
+        <w:t>ACC-0010</w:t>
+      </w:r>
+    </w:p>
+    <w:p>
+      <w:pPr>
+        <w:pStyle w:val="ListBullet"/>
+      </w:pPr>
+      <w:r>
+        <w:rPr>
+          <w:rFonts w:ascii="Noto Sans CJK JP" w:hAnsi="Noto Sans CJK JP" w:eastAsia="Noto Sans CJK JP"/>
+          <w:sz w:val="20"/>
+        </w:rPr>
+        <w:t>ACC-0030</w:t>
+      </w:r>
+    </w:p>
+    <w:p>
+      <w:pPr>
+        <w:pStyle w:val="ListBullet"/>
+      </w:pPr>
+      <w:r>
+        <w:rPr>
+          <w:rFonts w:ascii="Noto Sans CJK JP" w:hAnsi="Noto Sans CJK JP" w:eastAsia="Noto Sans CJK JP"/>
+          <w:sz w:val="20"/>
+        </w:rPr>
+        <w:t>ACC-0031</w:t>
+      </w:r>
+    </w:p>
+    <w:p>
+      <w:pPr>
+        <w:pStyle w:val="ListBullet"/>
+      </w:pPr>
+      <w:r>
+        <w:rPr>
+          <w:rFonts w:ascii="Noto Sans CJK JP" w:hAnsi="Noto Sans CJK JP" w:eastAsia="Noto Sans CJK JP"/>
+          <w:sz w:val="20"/>
+        </w:rPr>
+        <w:t>FAQ-ACC-0032</w:t>
+      </w:r>
+    </w:p>
+    <w:p/>
+    <w:p>
+      <w:pPr>
+        <w:pStyle w:val="Heading2"/>
+      </w:pPr>
+      <w:r>
+        <w:rPr>
+          <w:rFonts w:ascii="Noto Sans CJK JP" w:hAnsi="Noto Sans CJK JP" w:eastAsia="Noto Sans CJK JP"/>
+          <w:b/>
+          <w:color w:val="2F5496"/>
+          <w:sz w:val="28"/>
+        </w:rPr>
+        <w:t>参考資料</w:t>
+      </w:r>
+    </w:p>
+    <w:p/>
+    <w:p>
+      <w:pPr>
+        <w:pStyle w:val="ListBullet"/>
+      </w:pPr>
+      <w:r>
+        <w:rPr>
+          <w:rFonts w:ascii="Noto Sans CJK JP" w:hAnsi="Noto Sans CJK JP" w:eastAsia="Noto Sans CJK JP"/>
+          <w:sz w:val="20"/>
+        </w:rPr>
+        <w:t>Documento interno: `16_NotebookLM/ACC_NOTEBOOKLM_PACK_0001.md`</w:t>
+      </w:r>
+    </w:p>
+    <w:p>
+      <w:pPr>
+        <w:pStyle w:val="ListBullet"/>
+      </w:pPr>
+      <w:r>
+        <w:rPr>
+          <w:rFonts w:ascii="Noto Sans CJK JP" w:hAnsi="Noto Sans CJK JP" w:eastAsia="Noto Sans CJK JP"/>
+          <w:sz w:val="20"/>
+        </w:rPr>
+        <w:t>Documento interno: `10_Accident/ACC_NAVIGATION_GUIDE.md`</w:t>
+      </w:r>
+    </w:p>
+    <w:p/>
+    <w:p>
+      <w:pPr>
+        <w:pStyle w:val="Heading2"/>
+      </w:pPr>
+      <w:r>
+        <w:rPr>
+          <w:rFonts w:ascii="Noto Sans CJK JP" w:hAnsi="Noto Sans CJK JP" w:eastAsia="Noto Sans CJK JP"/>
+          <w:b/>
+          <w:color w:val="2F5496"/>
+          <w:sz w:val="28"/>
+        </w:rPr>
+        <w:t>タグ</w:t>
+      </w:r>
+    </w:p>
+    <w:p/>
+    <w:p>
+      <w:pPr>
+        <w:pStyle w:val="ListBullet"/>
+      </w:pPr>
+      <w:r>
+        <w:rPr>
+          <w:rFonts w:ascii="Noto Sans CJK JP" w:hAnsi="Noto Sans CJK JP" w:eastAsia="Noto Sans CJK JP"/>
+          <w:sz w:val="20"/>
+        </w:rPr>
+        <w:t>faq</w:t>
+      </w:r>
+    </w:p>
+    <w:p>
+      <w:pPr>
+        <w:pStyle w:val="ListBullet"/>
+      </w:pPr>
+      <w:r>
+        <w:rPr>
+          <w:rFonts w:ascii="Noto Sans CJK JP" w:hAnsi="Noto Sans CJK JP" w:eastAsia="Noto Sans CJK JP"/>
+          <w:sz w:val="20"/>
+        </w:rPr>
+        <w:t>acc</w:t>
+      </w:r>
+    </w:p>
+    <w:p>
+      <w:pPr>
+        <w:pStyle w:val="ListBullet"/>
+      </w:pPr>
+      <w:r>
+        <w:rPr>
+          <w:rFonts w:ascii="Noto Sans CJK JP" w:hAnsi="Noto Sans CJK JP" w:eastAsia="Noto Sans CJK JP"/>
+          <w:sz w:val="20"/>
+        </w:rPr>
+        <w:t>atendimento</w:t>
+      </w:r>
+    </w:p>
+    <w:p>
+      <w:pPr>
+        <w:pStyle w:val="ListBullet"/>
+      </w:pPr>
+      <w:r>
+        <w:rPr>
+          <w:rFonts w:ascii="Noto Sans CJK JP" w:hAnsi="Noto Sans CJK JP" w:eastAsia="Noto Sans CJK JP"/>
+          <w:sz w:val="20"/>
+        </w:rPr>
+        <w:t>sinistro</w:t>
+      </w:r>
+    </w:p>
+    <w:p>
+      <w:pPr>
+        <w:pStyle w:val="ListBullet"/>
+      </w:pPr>
+      <w:r>
+        <w:rPr>
+          <w:rFonts w:ascii="Noto Sans CJK JP" w:hAnsi="Noto Sans CJK JP" w:eastAsia="Noto Sans CJK JP"/>
+          <w:sz w:val="20"/>
+        </w:rPr>
+        <w:t>compliance</w:t>
+      </w:r>
+    </w:p>
+    <w:p/>
+    <w:p>
+      <w:pPr>
+        <w:pStyle w:val="Heading2"/>
+      </w:pPr>
+      <w:r>
+        <w:rPr>
+          <w:rFonts w:ascii="Noto Sans CJK JP" w:hAnsi="Noto Sans CJK JP" w:eastAsia="Noto Sans CJK JP"/>
+          <w:b/>
+          <w:color w:val="2F5496"/>
+          <w:sz w:val="28"/>
+        </w:rPr>
+        <w:t>関連項目</w:t>
+      </w:r>
+    </w:p>
+    <w:p/>
+    <w:p>
+      <w:pPr>
+        <w:pStyle w:val="ListBullet"/>
+      </w:pPr>
+      <w:r>
+        <w:rPr>
+          <w:rFonts w:ascii="Noto Sans CJK JP" w:hAnsi="Noto Sans CJK JP" w:eastAsia="Noto Sans CJK JP"/>
+          <w:sz w:val="20"/>
+        </w:rPr>
+        <w:t>`02_MasterDictionary/ACC/ACC-0032.md`</w:t>
+      </w:r>
+    </w:p>
+    <w:p>
+      <w:pPr>
+        <w:pStyle w:val="ListBullet"/>
+      </w:pPr>
+      <w:r>
+        <w:rPr>
+          <w:rFonts w:ascii="Noto Sans CJK JP" w:hAnsi="Noto Sans CJK JP" w:eastAsia="Noto Sans CJK JP"/>
+          <w:sz w:val="20"/>
+        </w:rPr>
+        <w:t>`02_MasterDictionary/ACC/ACC-0010.md`</w:t>
+      </w:r>
+    </w:p>
+    <w:p>
+      <w:pPr>
+        <w:pStyle w:val="ListBullet"/>
+      </w:pPr>
+      <w:r>
+        <w:rPr>
+          <w:rFonts w:ascii="Noto Sans CJK JP" w:hAnsi="Noto Sans CJK JP" w:eastAsia="Noto Sans CJK JP"/>
+          <w:sz w:val="20"/>
+        </w:rPr>
+        <w:t>`02_MasterDictionary/ACC/ACC-0030.md`</w:t>
+      </w:r>
+    </w:p>
+    <w:p>
+      <w:pPr>
+        <w:pStyle w:val="ListBullet"/>
+      </w:pPr>
+      <w:r>
+        <w:rPr>
+          <w:rFonts w:ascii="Noto Sans CJK JP" w:hAnsi="Noto Sans CJK JP" w:eastAsia="Noto Sans CJK JP"/>
+          <w:sz w:val="20"/>
+        </w:rPr>
+        <w:t>`02_MasterDictionary/ACC/ACC-0031.md`</w:t>
       </w:r>
     </w:p>
     <w:p/>
@@ -1299,7 +2373,7 @@
           <w:color w:val="1F4E79"/>
           <w:sz w:val="36"/>
         </w:rPr>
-        <w:t>FAQ-ACC-0032 - 支払われないと言われた場合はどうしますか。</w:t>
+        <w:t>FAQ-ACC-0033 - 追加書類を求められたらどうしますか。</w:t>
       </w:r>
     </w:p>
     <w:p/>
@@ -1388,7 +2462,7 @@
           <w:rFonts w:ascii="Noto Sans CJK JP" w:hAnsi="Noto Sans CJK JP" w:eastAsia="Noto Sans CJK JP"/>
           <w:sz w:val="21"/>
         </w:rPr>
-        <w:t>FAQ-ACC-0032</w:t>
+        <w:t>FAQ-ACC-0033</w:t>
       </w:r>
     </w:p>
     <w:p/>
@@ -1438,7 +2512,7 @@
           <w:rFonts w:ascii="Noto Sans CJK JP" w:hAnsi="Noto Sans CJK JP" w:eastAsia="Noto Sans CJK JP"/>
           <w:sz w:val="21"/>
         </w:rPr>
-        <w:t>支払われないと言われた場合はどうしますか。</w:t>
+        <w:t>追加書類を求められたらどうしますか。</w:t>
       </w:r>
     </w:p>
     <w:p/>
@@ -1466,7 +2540,7 @@
           <w:rFonts w:ascii="Noto Sans CJK JP" w:hAnsi="Noto Sans CJK JP" w:eastAsia="Noto Sans CJK JP"/>
           <w:sz w:val="20"/>
         </w:rPr>
-        <w:t>支払われないと言われた場合はどうしますか。</w:t>
+        <w:t>追加書類を求められたらどうしますか。</w:t>
       </w:r>
     </w:p>
     <w:p>
@@ -1515,7 +2589,7 @@
           <w:rFonts w:ascii="Noto Sans CJK JP" w:hAnsi="Noto Sans CJK JP" w:eastAsia="Noto Sans CJK JP"/>
           <w:sz w:val="21"/>
         </w:rPr>
-        <w:t>顧客が不支払の案内を受けて理由を確認したい場面。</w:t>
+        <w:t>保険会社から追加書類を求められた場面。</w:t>
       </w:r>
     </w:p>
     <w:p/>
@@ -1540,7 +2614,7 @@
           <w:rFonts w:ascii="Noto Sans CJK JP" w:hAnsi="Noto Sans CJK JP" w:eastAsia="Noto Sans CJK JP"/>
           <w:sz w:val="21"/>
         </w:rPr>
-        <w:t>保険会社が契約条件、免責事由、書類、事故状況などを確認した結果、支払い対象外と判断したことを通知する案内です。</w:t>
+        <w:t>保険会社が事故状況、治療内容、契約条件を確認するために、最初の提出後に追加で求める書類です。</w:t>
       </w:r>
     </w:p>
     <w:p/>
@@ -1580,7 +2654,7 @@
           <w:rFonts w:ascii="Noto Sans CJK JP" w:hAnsi="Noto Sans CJK JP" w:eastAsia="Noto Sans CJK JP"/>
           <w:sz w:val="21"/>
         </w:rPr>
-        <w:t>Se a seguradora não aprovar o pagamento, precisamos verificar o motivo indicado oficialmente.</w:t>
+        <w:t>A seguradora pode pedir documentos adicionais para analisar melhor o acidente e o tratamento.</w:t>
       </w:r>
     </w:p>
     <w:p/>
@@ -1605,7 +2679,7 @@
           <w:rFonts w:ascii="Noto Sans CJK JP" w:hAnsi="Noto Sans CJK JP" w:eastAsia="Noto Sans CJK JP"/>
           <w:sz w:val="21"/>
         </w:rPr>
-        <w:t>セ ア セグラドーラ ナォン アプロヴァール オ パガメント、プレシザモス ヴェリフィカール オ モチーヴォ インジカード オフィシアウメンチ</w:t>
+        <w:t>ア セグラドーラ ポジ ペジール ドクメントス アジシオナイス パラ アナリザール メリョール オ アシデンチ イ オ トラタメント</w:t>
       </w:r>
     </w:p>
     <w:p/>
@@ -1615,7 +2689,7 @@
           <w:rFonts w:ascii="Noto Sans CJK JP" w:hAnsi="Noto Sans CJK JP" w:eastAsia="Noto Sans CJK JP"/>
           <w:sz w:val="21"/>
         </w:rPr>
-        <w:t>日本語確認用: 不支払理由は正式通知で確認する。</w:t>
+        <w:t>日本語確認用: 追加書類は査定に必要な補足資料。</w:t>
       </w:r>
     </w:p>
     <w:p/>
@@ -1833,7 +2907,7 @@
           <w:rFonts w:ascii="Noto Sans CJK JP" w:hAnsi="Noto Sans CJK JP" w:eastAsia="Noto Sans CJK JP"/>
           <w:sz w:val="20"/>
         </w:rPr>
-        <w:t>ACC-0032</w:t>
+        <w:t>ACC-0033</w:t>
       </w:r>
     </w:p>
     <w:p>
@@ -1845,7 +2919,7 @@
           <w:rFonts w:ascii="Noto Sans CJK JP" w:hAnsi="Noto Sans CJK JP" w:eastAsia="Noto Sans CJK JP"/>
           <w:sz w:val="20"/>
         </w:rPr>
-        <w:t>ACC-0010</w:t>
+        <w:t>ACC-0014</w:t>
       </w:r>
     </w:p>
     <w:p>
@@ -1857,7 +2931,7 @@
           <w:rFonts w:ascii="Noto Sans CJK JP" w:hAnsi="Noto Sans CJK JP" w:eastAsia="Noto Sans CJK JP"/>
           <w:sz w:val="20"/>
         </w:rPr>
-        <w:t>ACC-0030</w:t>
+        <w:t>ACC-0015</w:t>
       </w:r>
     </w:p>
     <w:p>
@@ -1869,7 +2943,7 @@
           <w:rFonts w:ascii="Noto Sans CJK JP" w:hAnsi="Noto Sans CJK JP" w:eastAsia="Noto Sans CJK JP"/>
           <w:sz w:val="20"/>
         </w:rPr>
-        <w:t>ACC-0031</w:t>
+        <w:t>ACC-0025</w:t>
       </w:r>
     </w:p>
     <w:p/>
@@ -1897,7 +2971,7 @@
           <w:rFonts w:ascii="Noto Sans CJK JP" w:hAnsi="Noto Sans CJK JP" w:eastAsia="Noto Sans CJK JP"/>
           <w:sz w:val="20"/>
         </w:rPr>
-        <w:t>ACC-0032</w:t>
+        <w:t>ACC-0033</w:t>
       </w:r>
     </w:p>
     <w:p>
@@ -1909,7 +2983,7 @@
           <w:rFonts w:ascii="Noto Sans CJK JP" w:hAnsi="Noto Sans CJK JP" w:eastAsia="Noto Sans CJK JP"/>
           <w:sz w:val="20"/>
         </w:rPr>
-        <w:t>ACC-0010</w:t>
+        <w:t>ACC-0014</w:t>
       </w:r>
     </w:p>
     <w:p>
@@ -1921,7 +2995,7 @@
           <w:rFonts w:ascii="Noto Sans CJK JP" w:hAnsi="Noto Sans CJK JP" w:eastAsia="Noto Sans CJK JP"/>
           <w:sz w:val="20"/>
         </w:rPr>
-        <w:t>ACC-0030</w:t>
+        <w:t>ACC-0015</w:t>
       </w:r>
     </w:p>
     <w:p>
@@ -1933,7 +3007,7 @@
           <w:rFonts w:ascii="Noto Sans CJK JP" w:hAnsi="Noto Sans CJK JP" w:eastAsia="Noto Sans CJK JP"/>
           <w:sz w:val="20"/>
         </w:rPr>
-        <w:t>ACC-0031</w:t>
+        <w:t>ACC-0025</w:t>
       </w:r>
     </w:p>
     <w:p>
@@ -1945,7 +3019,7 @@
           <w:rFonts w:ascii="Noto Sans CJK JP" w:hAnsi="Noto Sans CJK JP" w:eastAsia="Noto Sans CJK JP"/>
           <w:sz w:val="20"/>
         </w:rPr>
-        <w:t>FAQ-ACC-0032</w:t>
+        <w:t>FAQ-ACC-0033</w:t>
       </w:r>
     </w:p>
     <w:p/>
@@ -2089,7 +3163,7 @@
           <w:rFonts w:ascii="Noto Sans CJK JP" w:hAnsi="Noto Sans CJK JP" w:eastAsia="Noto Sans CJK JP"/>
           <w:sz w:val="20"/>
         </w:rPr>
-        <w:t>`02_MasterDictionary/ACC/ACC-0032.md`</w:t>
+        <w:t>`02_MasterDictionary/ACC/ACC-0033.md`</w:t>
       </w:r>
     </w:p>
     <w:p>
@@ -2101,7 +3175,7 @@
           <w:rFonts w:ascii="Noto Sans CJK JP" w:hAnsi="Noto Sans CJK JP" w:eastAsia="Noto Sans CJK JP"/>
           <w:sz w:val="20"/>
         </w:rPr>
-        <w:t>`02_MasterDictionary/ACC/ACC-0010.md`</w:t>
+        <w:t>`02_MasterDictionary/ACC/ACC-0014.md`</w:t>
       </w:r>
     </w:p>
     <w:p>
@@ -2113,7 +3187,7 @@
           <w:rFonts w:ascii="Noto Sans CJK JP" w:hAnsi="Noto Sans CJK JP" w:eastAsia="Noto Sans CJK JP"/>
           <w:sz w:val="20"/>
         </w:rPr>
-        <w:t>`02_MasterDictionary/ACC/ACC-0030.md`</w:t>
+        <w:t>`02_MasterDictionary/ACC/ACC-0015.md`</w:t>
       </w:r>
     </w:p>
     <w:p>
@@ -2125,7 +3199,7 @@
           <w:rFonts w:ascii="Noto Sans CJK JP" w:hAnsi="Noto Sans CJK JP" w:eastAsia="Noto Sans CJK JP"/>
           <w:sz w:val="20"/>
         </w:rPr>
-        <w:t>`02_MasterDictionary/ACC/ACC-0031.md`</w:t>
+        <w:t>`02_MasterDictionary/ACC/ACC-0025.md`</w:t>
       </w:r>
     </w:p>
     <w:p/>
@@ -2307,7 +3381,7 @@
           <w:color w:val="1F4E79"/>
           <w:sz w:val="36"/>
         </w:rPr>
-        <w:t>FAQ-ACC-0033 - 追加書類を求められたらどうしますか。</w:t>
+        <w:t>FAQ-ACC-0034 - 書類に不備があるとどうなりますか。</w:t>
       </w:r>
     </w:p>
     <w:p/>
@@ -2396,7 +3470,7 @@
           <w:rFonts w:ascii="Noto Sans CJK JP" w:hAnsi="Noto Sans CJK JP" w:eastAsia="Noto Sans CJK JP"/>
           <w:sz w:val="21"/>
         </w:rPr>
-        <w:t>FAQ-ACC-0033</w:t>
+        <w:t>FAQ-ACC-0034</w:t>
       </w:r>
     </w:p>
     <w:p/>
@@ -2446,7 +3520,7 @@
           <w:rFonts w:ascii="Noto Sans CJK JP" w:hAnsi="Noto Sans CJK JP" w:eastAsia="Noto Sans CJK JP"/>
           <w:sz w:val="21"/>
         </w:rPr>
-        <w:t>追加書類を求められたらどうしますか。</w:t>
+        <w:t>書類に不備があるとどうなりますか。</w:t>
       </w:r>
     </w:p>
     <w:p/>
@@ -2474,7 +3548,7 @@
           <w:rFonts w:ascii="Noto Sans CJK JP" w:hAnsi="Noto Sans CJK JP" w:eastAsia="Noto Sans CJK JP"/>
           <w:sz w:val="20"/>
         </w:rPr>
-        <w:t>追加書類を求められたらどうしますか。</w:t>
+        <w:t>書類に不備があるとどうなりますか。</w:t>
       </w:r>
     </w:p>
     <w:p>
@@ -2523,7 +3597,7 @@
           <w:rFonts w:ascii="Noto Sans CJK JP" w:hAnsi="Noto Sans CJK JP" w:eastAsia="Noto Sans CJK JP"/>
           <w:sz w:val="21"/>
         </w:rPr>
-        <w:t>保険会社から追加書類を求められた場面。</w:t>
+        <w:t>提出書類に不足や記入漏れがあり、手続きが止まっている場面。</w:t>
       </w:r>
     </w:p>
     <w:p/>
@@ -2548,7 +3622,7 @@
           <w:rFonts w:ascii="Noto Sans CJK JP" w:hAnsi="Noto Sans CJK JP" w:eastAsia="Noto Sans CJK JP"/>
           <w:sz w:val="21"/>
         </w:rPr>
-        <w:t>保険会社が事故状況、治療内容、契約条件を確認するために、最初の提出後に追加で求める書類です。</w:t>
+        <w:t>提出書類に不足、記入漏れ、不一致、不鮮明な画像などがあり、手続きが進められない状態です。</w:t>
       </w:r>
     </w:p>
     <w:p/>
@@ -2588,7 +3662,7 @@
           <w:rFonts w:ascii="Noto Sans CJK JP" w:hAnsi="Noto Sans CJK JP" w:eastAsia="Noto Sans CJK JP"/>
           <w:sz w:val="21"/>
         </w:rPr>
-        <w:t>A seguradora pode pedir documentos adicionais para analisar melhor o acidente e o tratamento.</w:t>
+        <w:t>Se faltar informação ou houver erro nos documentos, a análise pode demorar mais.</w:t>
       </w:r>
     </w:p>
     <w:p/>
@@ -2613,7 +3687,7 @@
           <w:rFonts w:ascii="Noto Sans CJK JP" w:hAnsi="Noto Sans CJK JP" w:eastAsia="Noto Sans CJK JP"/>
           <w:sz w:val="21"/>
         </w:rPr>
-        <w:t>ア セグラドーラ ポジ ペジール ドクメントス アジシオナイス パラ アナリザール メリョール オ アシデンチ イ オ トラタメント</w:t>
+        <w:t>セ ファウタール インフォルマサォン オウ オウヴェール エホ ノス ドクメントス、ア アナリゼ ポジ デモラール マイス</w:t>
       </w:r>
     </w:p>
     <w:p/>
@@ -2623,7 +3697,7 @@
           <w:rFonts w:ascii="Noto Sans CJK JP" w:hAnsi="Noto Sans CJK JP" w:eastAsia="Noto Sans CJK JP"/>
           <w:sz w:val="21"/>
         </w:rPr>
-        <w:t>日本語確認用: 追加書類は査定に必要な補足資料。</w:t>
+        <w:t>日本語確認用: 書類不備は手続き遅延の原因になる。</w:t>
       </w:r>
     </w:p>
     <w:p/>
@@ -2841,6 +3915,30 @@
           <w:rFonts w:ascii="Noto Sans CJK JP" w:hAnsi="Noto Sans CJK JP" w:eastAsia="Noto Sans CJK JP"/>
           <w:sz w:val="20"/>
         </w:rPr>
+        <w:t>ACC-0034</w:t>
+      </w:r>
+    </w:p>
+    <w:p>
+      <w:pPr>
+        <w:pStyle w:val="ListBullet"/>
+      </w:pPr>
+      <w:r>
+        <w:rPr>
+          <w:rFonts w:ascii="Noto Sans CJK JP" w:hAnsi="Noto Sans CJK JP" w:eastAsia="Noto Sans CJK JP"/>
+          <w:sz w:val="20"/>
+        </w:rPr>
+        <w:t>ACC-0014</w:t>
+      </w:r>
+    </w:p>
+    <w:p>
+      <w:pPr>
+        <w:pStyle w:val="ListBullet"/>
+      </w:pPr>
+      <w:r>
+        <w:rPr>
+          <w:rFonts w:ascii="Noto Sans CJK JP" w:hAnsi="Noto Sans CJK JP" w:eastAsia="Noto Sans CJK JP"/>
+          <w:sz w:val="20"/>
+        </w:rPr>
         <w:t>ACC-0033</w:t>
       </w:r>
     </w:p>
@@ -2853,31 +3951,7 @@
           <w:rFonts w:ascii="Noto Sans CJK JP" w:hAnsi="Noto Sans CJK JP" w:eastAsia="Noto Sans CJK JP"/>
           <w:sz w:val="20"/>
         </w:rPr>
-        <w:t>ACC-0014</w:t>
-      </w:r>
-    </w:p>
-    <w:p>
-      <w:pPr>
-        <w:pStyle w:val="ListBullet"/>
-      </w:pPr>
-      <w:r>
-        <w:rPr>
-          <w:rFonts w:ascii="Noto Sans CJK JP" w:hAnsi="Noto Sans CJK JP" w:eastAsia="Noto Sans CJK JP"/>
-          <w:sz w:val="20"/>
-        </w:rPr>
-        <w:t>ACC-0015</w:t>
-      </w:r>
-    </w:p>
-    <w:p>
-      <w:pPr>
-        <w:pStyle w:val="ListBullet"/>
-      </w:pPr>
-      <w:r>
-        <w:rPr>
-          <w:rFonts w:ascii="Noto Sans CJK JP" w:hAnsi="Noto Sans CJK JP" w:eastAsia="Noto Sans CJK JP"/>
-          <w:sz w:val="20"/>
-        </w:rPr>
-        <w:t>ACC-0025</w:t>
+        <w:t>ACC-0030</w:t>
       </w:r>
     </w:p>
     <w:p/>
@@ -2905,6 +3979,30 @@
           <w:rFonts w:ascii="Noto Sans CJK JP" w:hAnsi="Noto Sans CJK JP" w:eastAsia="Noto Sans CJK JP"/>
           <w:sz w:val="20"/>
         </w:rPr>
+        <w:t>ACC-0034</w:t>
+      </w:r>
+    </w:p>
+    <w:p>
+      <w:pPr>
+        <w:pStyle w:val="ListBullet"/>
+      </w:pPr>
+      <w:r>
+        <w:rPr>
+          <w:rFonts w:ascii="Noto Sans CJK JP" w:hAnsi="Noto Sans CJK JP" w:eastAsia="Noto Sans CJK JP"/>
+          <w:sz w:val="20"/>
+        </w:rPr>
+        <w:t>ACC-0014</w:t>
+      </w:r>
+    </w:p>
+    <w:p>
+      <w:pPr>
+        <w:pStyle w:val="ListBullet"/>
+      </w:pPr>
+      <w:r>
+        <w:rPr>
+          <w:rFonts w:ascii="Noto Sans CJK JP" w:hAnsi="Noto Sans CJK JP" w:eastAsia="Noto Sans CJK JP"/>
+          <w:sz w:val="20"/>
+        </w:rPr>
         <w:t>ACC-0033</w:t>
       </w:r>
     </w:p>
@@ -2917,7 +4015,7 @@
           <w:rFonts w:ascii="Noto Sans CJK JP" w:hAnsi="Noto Sans CJK JP" w:eastAsia="Noto Sans CJK JP"/>
           <w:sz w:val="20"/>
         </w:rPr>
-        <w:t>ACC-0014</w:t>
+        <w:t>ACC-0030</w:t>
       </w:r>
     </w:p>
     <w:p>
@@ -2929,31 +4027,7 @@
           <w:rFonts w:ascii="Noto Sans CJK JP" w:hAnsi="Noto Sans CJK JP" w:eastAsia="Noto Sans CJK JP"/>
           <w:sz w:val="20"/>
         </w:rPr>
-        <w:t>ACC-0015</w:t>
-      </w:r>
-    </w:p>
-    <w:p>
-      <w:pPr>
-        <w:pStyle w:val="ListBullet"/>
-      </w:pPr>
-      <w:r>
-        <w:rPr>
-          <w:rFonts w:ascii="Noto Sans CJK JP" w:hAnsi="Noto Sans CJK JP" w:eastAsia="Noto Sans CJK JP"/>
-          <w:sz w:val="20"/>
-        </w:rPr>
-        <w:t>ACC-0025</w:t>
-      </w:r>
-    </w:p>
-    <w:p>
-      <w:pPr>
-        <w:pStyle w:val="ListBullet"/>
-      </w:pPr>
-      <w:r>
-        <w:rPr>
-          <w:rFonts w:ascii="Noto Sans CJK JP" w:hAnsi="Noto Sans CJK JP" w:eastAsia="Noto Sans CJK JP"/>
-          <w:sz w:val="20"/>
-        </w:rPr>
-        <w:t>FAQ-ACC-0033</w:t>
+        <w:t>FAQ-ACC-0034</w:t>
       </w:r>
     </w:p>
     <w:p/>
@@ -3097,6 +4171,30 @@
           <w:rFonts w:ascii="Noto Sans CJK JP" w:hAnsi="Noto Sans CJK JP" w:eastAsia="Noto Sans CJK JP"/>
           <w:sz w:val="20"/>
         </w:rPr>
+        <w:t>`02_MasterDictionary/ACC/ACC-0034.md`</w:t>
+      </w:r>
+    </w:p>
+    <w:p>
+      <w:pPr>
+        <w:pStyle w:val="ListBullet"/>
+      </w:pPr>
+      <w:r>
+        <w:rPr>
+          <w:rFonts w:ascii="Noto Sans CJK JP" w:hAnsi="Noto Sans CJK JP" w:eastAsia="Noto Sans CJK JP"/>
+          <w:sz w:val="20"/>
+        </w:rPr>
+        <w:t>`02_MasterDictionary/ACC/ACC-0014.md`</w:t>
+      </w:r>
+    </w:p>
+    <w:p>
+      <w:pPr>
+        <w:pStyle w:val="ListBullet"/>
+      </w:pPr>
+      <w:r>
+        <w:rPr>
+          <w:rFonts w:ascii="Noto Sans CJK JP" w:hAnsi="Noto Sans CJK JP" w:eastAsia="Noto Sans CJK JP"/>
+          <w:sz w:val="20"/>
+        </w:rPr>
         <w:t>`02_MasterDictionary/ACC/ACC-0033.md`</w:t>
       </w:r>
     </w:p>
@@ -3109,31 +4207,7 @@
           <w:rFonts w:ascii="Noto Sans CJK JP" w:hAnsi="Noto Sans CJK JP" w:eastAsia="Noto Sans CJK JP"/>
           <w:sz w:val="20"/>
         </w:rPr>
-        <w:t>`02_MasterDictionary/ACC/ACC-0014.md`</w:t>
-      </w:r>
-    </w:p>
-    <w:p>
-      <w:pPr>
-        <w:pStyle w:val="ListBullet"/>
-      </w:pPr>
-      <w:r>
-        <w:rPr>
-          <w:rFonts w:ascii="Noto Sans CJK JP" w:hAnsi="Noto Sans CJK JP" w:eastAsia="Noto Sans CJK JP"/>
-          <w:sz w:val="20"/>
-        </w:rPr>
-        <w:t>`02_MasterDictionary/ACC/ACC-0015.md`</w:t>
-      </w:r>
-    </w:p>
-    <w:p>
-      <w:pPr>
-        <w:pStyle w:val="ListBullet"/>
-      </w:pPr>
-      <w:r>
-        <w:rPr>
-          <w:rFonts w:ascii="Noto Sans CJK JP" w:hAnsi="Noto Sans CJK JP" w:eastAsia="Noto Sans CJK JP"/>
-          <w:sz w:val="20"/>
-        </w:rPr>
-        <w:t>`02_MasterDictionary/ACC/ACC-0025.md`</w:t>
+        <w:t>`02_MasterDictionary/ACC/ACC-0030.md`</w:t>
       </w:r>
     </w:p>
     <w:p/>
@@ -3315,7 +4389,7 @@
           <w:color w:val="1F4E79"/>
           <w:sz w:val="36"/>
         </w:rPr>
-        <w:t>FAQ-ACC-0034 - 書類に不備があるとどうなりますか。</w:t>
+        <w:t>FAQ-ACC-0035 - なぜ事故の事実確認が必要ですか。</w:t>
       </w:r>
     </w:p>
     <w:p/>
@@ -3404,7 +4478,7 @@
           <w:rFonts w:ascii="Noto Sans CJK JP" w:hAnsi="Noto Sans CJK JP" w:eastAsia="Noto Sans CJK JP"/>
           <w:sz w:val="21"/>
         </w:rPr>
-        <w:t>FAQ-ACC-0034</w:t>
+        <w:t>FAQ-ACC-0035</w:t>
       </w:r>
     </w:p>
     <w:p/>
@@ -3454,7 +4528,7 @@
           <w:rFonts w:ascii="Noto Sans CJK JP" w:hAnsi="Noto Sans CJK JP" w:eastAsia="Noto Sans CJK JP"/>
           <w:sz w:val="21"/>
         </w:rPr>
-        <w:t>書類に不備があるとどうなりますか。</w:t>
+        <w:t>なぜ事故の事実確認が必要ですか。</w:t>
       </w:r>
     </w:p>
     <w:p/>
@@ -3482,7 +4556,7 @@
           <w:rFonts w:ascii="Noto Sans CJK JP" w:hAnsi="Noto Sans CJK JP" w:eastAsia="Noto Sans CJK JP"/>
           <w:sz w:val="20"/>
         </w:rPr>
-        <w:t>書類に不備があるとどうなりますか。</w:t>
+        <w:t>なぜ事故の事実確認が必要ですか。</w:t>
       </w:r>
     </w:p>
     <w:p>
@@ -3531,7 +4605,7 @@
           <w:rFonts w:ascii="Noto Sans CJK JP" w:hAnsi="Noto Sans CJK JP" w:eastAsia="Noto Sans CJK JP"/>
           <w:sz w:val="21"/>
         </w:rPr>
-        <w:t>提出書類に不足や記入漏れがあり、手続きが止まっている場面。</w:t>
+        <w:t>保険会社が事故の経緯や書類の整合性を確認している場面。</w:t>
       </w:r>
     </w:p>
     <w:p/>
@@ -3556,7 +4630,7 @@
           <w:rFonts w:ascii="Noto Sans CJK JP" w:hAnsi="Noto Sans CJK JP" w:eastAsia="Noto Sans CJK JP"/>
           <w:sz w:val="21"/>
         </w:rPr>
-        <w:t>提出書類に不足、記入漏れ、不一致、不鮮明な画像などがあり、手続きが進められない状態です。</w:t>
+        <w:t>事故の日時、場所、原因、経緯、関係者、治療内容などについて、提出資料と顧客説明を照合することです。</w:t>
       </w:r>
     </w:p>
     <w:p/>
@@ -3596,7 +4670,7 @@
           <w:rFonts w:ascii="Noto Sans CJK JP" w:hAnsi="Noto Sans CJK JP" w:eastAsia="Noto Sans CJK JP"/>
           <w:sz w:val="21"/>
         </w:rPr>
-        <w:t>Se faltar informação ou houver erro nos documentos, a análise pode demorar mais.</w:t>
+        <w:t>A seguradora precisa comparar a explicação do acidente com os documentos apresentados.</w:t>
       </w:r>
     </w:p>
     <w:p/>
@@ -3621,7 +4695,7 @@
           <w:rFonts w:ascii="Noto Sans CJK JP" w:hAnsi="Noto Sans CJK JP" w:eastAsia="Noto Sans CJK JP"/>
           <w:sz w:val="21"/>
         </w:rPr>
-        <w:t>セ ファウタール インフォルマサォン オウ オウヴェール エホ ノス ドクメントス、ア アナリゼ ポジ デモラール マイス</w:t>
+        <w:t>ア セグラドーラ プレシザ コンパラール ア エスプリカサォン ド アシデンチ コン オス ドクメントス アプレゼンタードス</w:t>
       </w:r>
     </w:p>
     <w:p/>
@@ -3631,7 +4705,7 @@
           <w:rFonts w:ascii="Noto Sans CJK JP" w:hAnsi="Noto Sans CJK JP" w:eastAsia="Noto Sans CJK JP"/>
           <w:sz w:val="21"/>
         </w:rPr>
-        <w:t>日本語確認用: 書類不備は手続き遅延の原因になる。</w:t>
+        <w:t>日本語確認用: 事実確認は説明と書類の照合。</w:t>
       </w:r>
     </w:p>
     <w:p/>
@@ -3849,43 +4923,43 @@
           <w:rFonts w:ascii="Noto Sans CJK JP" w:hAnsi="Noto Sans CJK JP" w:eastAsia="Noto Sans CJK JP"/>
           <w:sz w:val="20"/>
         </w:rPr>
+        <w:t>ACC-0035</w:t>
+      </w:r>
+    </w:p>
+    <w:p>
+      <w:pPr>
+        <w:pStyle w:val="ListBullet"/>
+      </w:pPr>
+      <w:r>
+        <w:rPr>
+          <w:rFonts w:ascii="Noto Sans CJK JP" w:hAnsi="Noto Sans CJK JP" w:eastAsia="Noto Sans CJK JP"/>
+          <w:sz w:val="20"/>
+        </w:rPr>
+        <w:t>ACC-0020</w:t>
+      </w:r>
+    </w:p>
+    <w:p>
+      <w:pPr>
+        <w:pStyle w:val="ListBullet"/>
+      </w:pPr>
+      <w:r>
+        <w:rPr>
+          <w:rFonts w:ascii="Noto Sans CJK JP" w:hAnsi="Noto Sans CJK JP" w:eastAsia="Noto Sans CJK JP"/>
+          <w:sz w:val="20"/>
+        </w:rPr>
+        <w:t>ACC-0033</w:t>
+      </w:r>
+    </w:p>
+    <w:p>
+      <w:pPr>
+        <w:pStyle w:val="ListBullet"/>
+      </w:pPr>
+      <w:r>
+        <w:rPr>
+          <w:rFonts w:ascii="Noto Sans CJK JP" w:hAnsi="Noto Sans CJK JP" w:eastAsia="Noto Sans CJK JP"/>
+          <w:sz w:val="20"/>
+        </w:rPr>
         <w:t>ACC-0034</w:t>
-      </w:r>
-    </w:p>
-    <w:p>
-      <w:pPr>
-        <w:pStyle w:val="ListBullet"/>
-      </w:pPr>
-      <w:r>
-        <w:rPr>
-          <w:rFonts w:ascii="Noto Sans CJK JP" w:hAnsi="Noto Sans CJK JP" w:eastAsia="Noto Sans CJK JP"/>
-          <w:sz w:val="20"/>
-        </w:rPr>
-        <w:t>ACC-0014</w:t>
-      </w:r>
-    </w:p>
-    <w:p>
-      <w:pPr>
-        <w:pStyle w:val="ListBullet"/>
-      </w:pPr>
-      <w:r>
-        <w:rPr>
-          <w:rFonts w:ascii="Noto Sans CJK JP" w:hAnsi="Noto Sans CJK JP" w:eastAsia="Noto Sans CJK JP"/>
-          <w:sz w:val="20"/>
-        </w:rPr>
-        <w:t>ACC-0033</w:t>
-      </w:r>
-    </w:p>
-    <w:p>
-      <w:pPr>
-        <w:pStyle w:val="ListBullet"/>
-      </w:pPr>
-      <w:r>
-        <w:rPr>
-          <w:rFonts w:ascii="Noto Sans CJK JP" w:hAnsi="Noto Sans CJK JP" w:eastAsia="Noto Sans CJK JP"/>
-          <w:sz w:val="20"/>
-        </w:rPr>
-        <w:t>ACC-0030</w:t>
       </w:r>
     </w:p>
     <w:p/>
@@ -3913,6 +4987,42 @@
           <w:rFonts w:ascii="Noto Sans CJK JP" w:hAnsi="Noto Sans CJK JP" w:eastAsia="Noto Sans CJK JP"/>
           <w:sz w:val="20"/>
         </w:rPr>
+        <w:t>ACC-0035</w:t>
+      </w:r>
+    </w:p>
+    <w:p>
+      <w:pPr>
+        <w:pStyle w:val="ListBullet"/>
+      </w:pPr>
+      <w:r>
+        <w:rPr>
+          <w:rFonts w:ascii="Noto Sans CJK JP" w:hAnsi="Noto Sans CJK JP" w:eastAsia="Noto Sans CJK JP"/>
+          <w:sz w:val="20"/>
+        </w:rPr>
+        <w:t>ACC-0020</w:t>
+      </w:r>
+    </w:p>
+    <w:p>
+      <w:pPr>
+        <w:pStyle w:val="ListBullet"/>
+      </w:pPr>
+      <w:r>
+        <w:rPr>
+          <w:rFonts w:ascii="Noto Sans CJK JP" w:hAnsi="Noto Sans CJK JP" w:eastAsia="Noto Sans CJK JP"/>
+          <w:sz w:val="20"/>
+        </w:rPr>
+        <w:t>ACC-0033</w:t>
+      </w:r>
+    </w:p>
+    <w:p>
+      <w:pPr>
+        <w:pStyle w:val="ListBullet"/>
+      </w:pPr>
+      <w:r>
+        <w:rPr>
+          <w:rFonts w:ascii="Noto Sans CJK JP" w:hAnsi="Noto Sans CJK JP" w:eastAsia="Noto Sans CJK JP"/>
+          <w:sz w:val="20"/>
+        </w:rPr>
         <w:t>ACC-0034</w:t>
       </w:r>
     </w:p>
@@ -3925,43 +5035,7 @@
           <w:rFonts w:ascii="Noto Sans CJK JP" w:hAnsi="Noto Sans CJK JP" w:eastAsia="Noto Sans CJK JP"/>
           <w:sz w:val="20"/>
         </w:rPr>
-        <w:t>ACC-0014</w:t>
-      </w:r>
-    </w:p>
-    <w:p>
-      <w:pPr>
-        <w:pStyle w:val="ListBullet"/>
-      </w:pPr>
-      <w:r>
-        <w:rPr>
-          <w:rFonts w:ascii="Noto Sans CJK JP" w:hAnsi="Noto Sans CJK JP" w:eastAsia="Noto Sans CJK JP"/>
-          <w:sz w:val="20"/>
-        </w:rPr>
-        <w:t>ACC-0033</w:t>
-      </w:r>
-    </w:p>
-    <w:p>
-      <w:pPr>
-        <w:pStyle w:val="ListBullet"/>
-      </w:pPr>
-      <w:r>
-        <w:rPr>
-          <w:rFonts w:ascii="Noto Sans CJK JP" w:hAnsi="Noto Sans CJK JP" w:eastAsia="Noto Sans CJK JP"/>
-          <w:sz w:val="20"/>
-        </w:rPr>
-        <w:t>ACC-0030</w:t>
-      </w:r>
-    </w:p>
-    <w:p>
-      <w:pPr>
-        <w:pStyle w:val="ListBullet"/>
-      </w:pPr>
-      <w:r>
-        <w:rPr>
-          <w:rFonts w:ascii="Noto Sans CJK JP" w:hAnsi="Noto Sans CJK JP" w:eastAsia="Noto Sans CJK JP"/>
-          <w:sz w:val="20"/>
-        </w:rPr>
-        <w:t>FAQ-ACC-0034</w:t>
+        <w:t>FAQ-ACC-0035</w:t>
       </w:r>
     </w:p>
     <w:p/>
@@ -4105,43 +5179,43 @@
           <w:rFonts w:ascii="Noto Sans CJK JP" w:hAnsi="Noto Sans CJK JP" w:eastAsia="Noto Sans CJK JP"/>
           <w:sz w:val="20"/>
         </w:rPr>
+        <w:t>`02_MasterDictionary/ACC/ACC-0035.md`</w:t>
+      </w:r>
+    </w:p>
+    <w:p>
+      <w:pPr>
+        <w:pStyle w:val="ListBullet"/>
+      </w:pPr>
+      <w:r>
+        <w:rPr>
+          <w:rFonts w:ascii="Noto Sans CJK JP" w:hAnsi="Noto Sans CJK JP" w:eastAsia="Noto Sans CJK JP"/>
+          <w:sz w:val="20"/>
+        </w:rPr>
+        <w:t>`02_MasterDictionary/ACC/ACC-0020.md`</w:t>
+      </w:r>
+    </w:p>
+    <w:p>
+      <w:pPr>
+        <w:pStyle w:val="ListBullet"/>
+      </w:pPr>
+      <w:r>
+        <w:rPr>
+          <w:rFonts w:ascii="Noto Sans CJK JP" w:hAnsi="Noto Sans CJK JP" w:eastAsia="Noto Sans CJK JP"/>
+          <w:sz w:val="20"/>
+        </w:rPr>
+        <w:t>`02_MasterDictionary/ACC/ACC-0033.md`</w:t>
+      </w:r>
+    </w:p>
+    <w:p>
+      <w:pPr>
+        <w:pStyle w:val="ListBullet"/>
+      </w:pPr>
+      <w:r>
+        <w:rPr>
+          <w:rFonts w:ascii="Noto Sans CJK JP" w:hAnsi="Noto Sans CJK JP" w:eastAsia="Noto Sans CJK JP"/>
+          <w:sz w:val="20"/>
+        </w:rPr>
         <w:t>`02_MasterDictionary/ACC/ACC-0034.md`</w:t>
-      </w:r>
-    </w:p>
-    <w:p>
-      <w:pPr>
-        <w:pStyle w:val="ListBullet"/>
-      </w:pPr>
-      <w:r>
-        <w:rPr>
-          <w:rFonts w:ascii="Noto Sans CJK JP" w:hAnsi="Noto Sans CJK JP" w:eastAsia="Noto Sans CJK JP"/>
-          <w:sz w:val="20"/>
-        </w:rPr>
-        <w:t>`02_MasterDictionary/ACC/ACC-0014.md`</w:t>
-      </w:r>
-    </w:p>
-    <w:p>
-      <w:pPr>
-        <w:pStyle w:val="ListBullet"/>
-      </w:pPr>
-      <w:r>
-        <w:rPr>
-          <w:rFonts w:ascii="Noto Sans CJK JP" w:hAnsi="Noto Sans CJK JP" w:eastAsia="Noto Sans CJK JP"/>
-          <w:sz w:val="20"/>
-        </w:rPr>
-        <w:t>`02_MasterDictionary/ACC/ACC-0033.md`</w:t>
-      </w:r>
-    </w:p>
-    <w:p>
-      <w:pPr>
-        <w:pStyle w:val="ListBullet"/>
-      </w:pPr>
-      <w:r>
-        <w:rPr>
-          <w:rFonts w:ascii="Noto Sans CJK JP" w:hAnsi="Noto Sans CJK JP" w:eastAsia="Noto Sans CJK JP"/>
-          <w:sz w:val="20"/>
-        </w:rPr>
-        <w:t>`02_MasterDictionary/ACC/ACC-0030.md`</w:t>
       </w:r>
     </w:p>
     <w:p/>
@@ -4323,7 +5397,7 @@
           <w:color w:val="1F4E79"/>
           <w:sz w:val="36"/>
         </w:rPr>
-        <w:t>FAQ-ACC-0035 - なぜ事故の事実確認が必要ですか。</w:t>
+        <w:t>FAQ-ACC-0036 - 事故状況はどのように説明すればよいですか。</w:t>
       </w:r>
     </w:p>
     <w:p/>
@@ -4412,7 +5486,7 @@
           <w:rFonts w:ascii="Noto Sans CJK JP" w:hAnsi="Noto Sans CJK JP" w:eastAsia="Noto Sans CJK JP"/>
           <w:sz w:val="21"/>
         </w:rPr>
-        <w:t>FAQ-ACC-0035</w:t>
+        <w:t>FAQ-ACC-0036</w:t>
       </w:r>
     </w:p>
     <w:p/>
@@ -4462,7 +5536,7 @@
           <w:rFonts w:ascii="Noto Sans CJK JP" w:hAnsi="Noto Sans CJK JP" w:eastAsia="Noto Sans CJK JP"/>
           <w:sz w:val="21"/>
         </w:rPr>
-        <w:t>なぜ事故の事実確認が必要ですか。</w:t>
+        <w:t>事故状況はどのように説明すればよいですか。</w:t>
       </w:r>
     </w:p>
     <w:p/>
@@ -4490,7 +5564,7 @@
           <w:rFonts w:ascii="Noto Sans CJK JP" w:hAnsi="Noto Sans CJK JP" w:eastAsia="Noto Sans CJK JP"/>
           <w:sz w:val="20"/>
         </w:rPr>
-        <w:t>なぜ事故の事実確認が必要ですか。</w:t>
+        <w:t>事故状況はどのように説明すればよいですか。</w:t>
       </w:r>
     </w:p>
     <w:p>
@@ -4539,7 +5613,7 @@
           <w:rFonts w:ascii="Noto Sans CJK JP" w:hAnsi="Noto Sans CJK JP" w:eastAsia="Noto Sans CJK JP"/>
           <w:sz w:val="21"/>
         </w:rPr>
-        <w:t>保険会社が事故の経緯や書類の整合性を確認している場面。</w:t>
+        <w:t>顧客が事故状況報告の書き方に迷っている場面。</w:t>
       </w:r>
     </w:p>
     <w:p/>
@@ -4564,7 +5638,7 @@
           <w:rFonts w:ascii="Noto Sans CJK JP" w:hAnsi="Noto Sans CJK JP" w:eastAsia="Noto Sans CJK JP"/>
           <w:sz w:val="21"/>
         </w:rPr>
-        <w:t>事故の日時、場所、原因、経緯、関係者、治療内容などについて、提出資料と顧客説明を照合することです。</w:t>
+        <w:t>顧客が事故の発生状況、原因、場所、時間、けがの内容を保険会社へ説明する報告です。</w:t>
       </w:r>
     </w:p>
     <w:p/>
@@ -4604,7 +5678,7 @@
           <w:rFonts w:ascii="Noto Sans CJK JP" w:hAnsi="Noto Sans CJK JP" w:eastAsia="Noto Sans CJK JP"/>
           <w:sz w:val="21"/>
         </w:rPr>
-        <w:t>A seguradora precisa comparar a explicação do acidente com os documentos apresentados.</w:t>
+        <w:t>Explique o acidente com precisão: quando, onde, como aconteceu e qual foi a lesão.</w:t>
       </w:r>
     </w:p>
     <w:p/>
@@ -4629,7 +5703,7 @@
           <w:rFonts w:ascii="Noto Sans CJK JP" w:hAnsi="Noto Sans CJK JP" w:eastAsia="Noto Sans CJK JP"/>
           <w:sz w:val="21"/>
         </w:rPr>
-        <w:t>ア セグラドーラ プレシザ コンパラール ア エスプリカサォン ド アシデンチ コン オス ドクメントス アプレゼンタードス</w:t>
+        <w:t>エスプリキ オ アシデンチ コン プレシザォン。クアンド、オンジ、コモ アコンテセウ イ クアウ フォイ ア レザォン</w:t>
       </w:r>
     </w:p>
     <w:p/>
@@ -4639,7 +5713,7 @@
           <w:rFonts w:ascii="Noto Sans CJK JP" w:hAnsi="Noto Sans CJK JP" w:eastAsia="Noto Sans CJK JP"/>
           <w:sz w:val="21"/>
         </w:rPr>
-        <w:t>日本語確認用: 事実確認は説明と書類の照合。</w:t>
+        <w:t>日本語確認用: 事故状況報告は正確さが重要。</w:t>
       </w:r>
     </w:p>
     <w:p/>
@@ -4857,6 +5931,18 @@
           <w:rFonts w:ascii="Noto Sans CJK JP" w:hAnsi="Noto Sans CJK JP" w:eastAsia="Noto Sans CJK JP"/>
           <w:sz w:val="20"/>
         </w:rPr>
+        <w:t>ACC-0036</w:t>
+      </w:r>
+    </w:p>
+    <w:p>
+      <w:pPr>
+        <w:pStyle w:val="ListBullet"/>
+      </w:pPr>
+      <w:r>
+        <w:rPr>
+          <w:rFonts w:ascii="Noto Sans CJK JP" w:hAnsi="Noto Sans CJK JP" w:eastAsia="Noto Sans CJK JP"/>
+          <w:sz w:val="20"/>
+        </w:rPr>
         <w:t>ACC-0035</w:t>
       </w:r>
     </w:p>
@@ -4881,19 +5967,7 @@
           <w:rFonts w:ascii="Noto Sans CJK JP" w:hAnsi="Noto Sans CJK JP" w:eastAsia="Noto Sans CJK JP"/>
           <w:sz w:val="20"/>
         </w:rPr>
-        <w:t>ACC-0033</w:t>
-      </w:r>
-    </w:p>
-    <w:p>
-      <w:pPr>
-        <w:pStyle w:val="ListBullet"/>
-      </w:pPr>
-      <w:r>
-        <w:rPr>
-          <w:rFonts w:ascii="Noto Sans CJK JP" w:hAnsi="Noto Sans CJK JP" w:eastAsia="Noto Sans CJK JP"/>
-          <w:sz w:val="20"/>
-        </w:rPr>
-        <w:t>ACC-0034</w:t>
+        <w:t>ACC-0004</w:t>
       </w:r>
     </w:p>
     <w:p/>
@@ -4921,6 +5995,18 @@
           <w:rFonts w:ascii="Noto Sans CJK JP" w:hAnsi="Noto Sans CJK JP" w:eastAsia="Noto Sans CJK JP"/>
           <w:sz w:val="20"/>
         </w:rPr>
+        <w:t>ACC-0036</w:t>
+      </w:r>
+    </w:p>
+    <w:p>
+      <w:pPr>
+        <w:pStyle w:val="ListBullet"/>
+      </w:pPr>
+      <w:r>
+        <w:rPr>
+          <w:rFonts w:ascii="Noto Sans CJK JP" w:hAnsi="Noto Sans CJK JP" w:eastAsia="Noto Sans CJK JP"/>
+          <w:sz w:val="20"/>
+        </w:rPr>
         <w:t>ACC-0035</w:t>
       </w:r>
     </w:p>
@@ -4945,7 +6031,7 @@
           <w:rFonts w:ascii="Noto Sans CJK JP" w:hAnsi="Noto Sans CJK JP" w:eastAsia="Noto Sans CJK JP"/>
           <w:sz w:val="20"/>
         </w:rPr>
-        <w:t>ACC-0033</w:t>
+        <w:t>ACC-0004</w:t>
       </w:r>
     </w:p>
     <w:p>
@@ -4957,19 +6043,7 @@
           <w:rFonts w:ascii="Noto Sans CJK JP" w:hAnsi="Noto Sans CJK JP" w:eastAsia="Noto Sans CJK JP"/>
           <w:sz w:val="20"/>
         </w:rPr>
-        <w:t>ACC-0034</w:t>
-      </w:r>
-    </w:p>
-    <w:p>
-      <w:pPr>
-        <w:pStyle w:val="ListBullet"/>
-      </w:pPr>
-      <w:r>
-        <w:rPr>
-          <w:rFonts w:ascii="Noto Sans CJK JP" w:hAnsi="Noto Sans CJK JP" w:eastAsia="Noto Sans CJK JP"/>
-          <w:sz w:val="20"/>
-        </w:rPr>
-        <w:t>FAQ-ACC-0035</w:t>
+        <w:t>FAQ-ACC-0036</w:t>
       </w:r>
     </w:p>
     <w:p/>
@@ -5113,6 +6187,18 @@
           <w:rFonts w:ascii="Noto Sans CJK JP" w:hAnsi="Noto Sans CJK JP" w:eastAsia="Noto Sans CJK JP"/>
           <w:sz w:val="20"/>
         </w:rPr>
+        <w:t>`02_MasterDictionary/ACC/ACC-0036.md`</w:t>
+      </w:r>
+    </w:p>
+    <w:p>
+      <w:pPr>
+        <w:pStyle w:val="ListBullet"/>
+      </w:pPr>
+      <w:r>
+        <w:rPr>
+          <w:rFonts w:ascii="Noto Sans CJK JP" w:hAnsi="Noto Sans CJK JP" w:eastAsia="Noto Sans CJK JP"/>
+          <w:sz w:val="20"/>
+        </w:rPr>
         <w:t>`02_MasterDictionary/ACC/ACC-0035.md`</w:t>
       </w:r>
     </w:p>
@@ -5137,19 +6223,7 @@
           <w:rFonts w:ascii="Noto Sans CJK JP" w:hAnsi="Noto Sans CJK JP" w:eastAsia="Noto Sans CJK JP"/>
           <w:sz w:val="20"/>
         </w:rPr>
-        <w:t>`02_MasterDictionary/ACC/ACC-0033.md`</w:t>
-      </w:r>
-    </w:p>
-    <w:p>
-      <w:pPr>
-        <w:pStyle w:val="ListBullet"/>
-      </w:pPr>
-      <w:r>
-        <w:rPr>
-          <w:rFonts w:ascii="Noto Sans CJK JP" w:hAnsi="Noto Sans CJK JP" w:eastAsia="Noto Sans CJK JP"/>
-          <w:sz w:val="20"/>
-        </w:rPr>
-        <w:t>`02_MasterDictionary/ACC/ACC-0034.md`</w:t>
+        <w:t>`02_MasterDictionary/ACC/ACC-0004.md`</w:t>
       </w:r>
     </w:p>
     <w:p/>
@@ -5331,7 +6405,7 @@
           <w:color w:val="1F4E79"/>
           <w:sz w:val="36"/>
         </w:rPr>
-        <w:t>FAQ-ACC-0036 - 事故状況はどのように説明すればよいですか。</w:t>
+        <w:t>FAQ-ACC-0037 - 診療明細書では何を確認しますか。</w:t>
       </w:r>
     </w:p>
     <w:p/>
@@ -5420,7 +6494,7 @@
           <w:rFonts w:ascii="Noto Sans CJK JP" w:hAnsi="Noto Sans CJK JP" w:eastAsia="Noto Sans CJK JP"/>
           <w:sz w:val="21"/>
         </w:rPr>
-        <w:t>FAQ-ACC-0036</w:t>
+        <w:t>FAQ-ACC-0037</w:t>
       </w:r>
     </w:p>
     <w:p/>
@@ -5470,7 +6544,7 @@
           <w:rFonts w:ascii="Noto Sans CJK JP" w:hAnsi="Noto Sans CJK JP" w:eastAsia="Noto Sans CJK JP"/>
           <w:sz w:val="21"/>
         </w:rPr>
-        <w:t>事故状況はどのように説明すればよいですか。</w:t>
+        <w:t>診療明細書では何を確認しますか。</w:t>
       </w:r>
     </w:p>
     <w:p/>
@@ -5498,7 +6572,7 @@
           <w:rFonts w:ascii="Noto Sans CJK JP" w:hAnsi="Noto Sans CJK JP" w:eastAsia="Noto Sans CJK JP"/>
           <w:sz w:val="20"/>
         </w:rPr>
-        <w:t>事故状況はどのように説明すればよいですか。</w:t>
+        <w:t>診療明細書では何を確認しますか。</w:t>
       </w:r>
     </w:p>
     <w:p>
@@ -5547,7 +6621,7 @@
           <w:rFonts w:ascii="Noto Sans CJK JP" w:hAnsi="Noto Sans CJK JP" w:eastAsia="Noto Sans CJK JP"/>
           <w:sz w:val="21"/>
         </w:rPr>
-        <w:t>顧客が事故状況報告の書き方に迷っている場面。</w:t>
+        <w:t>診療明細書の提出後、何を見られるのか顧客が質問している場面。</w:t>
       </w:r>
     </w:p>
     <w:p/>
@@ -5572,7 +6646,7 @@
           <w:rFonts w:ascii="Noto Sans CJK JP" w:hAnsi="Noto Sans CJK JP" w:eastAsia="Noto Sans CJK JP"/>
           <w:sz w:val="21"/>
         </w:rPr>
-        <w:t>顧客が事故の発生状況、原因、場所、時間、けがの内容を保険会社へ説明する報告です。</w:t>
+        <w:t>診療明細書に記載された診療内容、日数、手術、検査、治療費などを保険金請求上確認することです。</w:t>
       </w:r>
     </w:p>
     <w:p/>
@@ -5612,7 +6686,7 @@
           <w:rFonts w:ascii="Noto Sans CJK JP" w:hAnsi="Noto Sans CJK JP" w:eastAsia="Noto Sans CJK JP"/>
           <w:sz w:val="21"/>
         </w:rPr>
-        <w:t>Explique o acidente com precisão: quando, onde, como aconteceu e qual foi a lesão.</w:t>
+        <w:t>Vamos verificar o detalhamento médico para entender o tratamento realizado.</w:t>
       </w:r>
     </w:p>
     <w:p/>
@@ -5637,7 +6711,7 @@
           <w:rFonts w:ascii="Noto Sans CJK JP" w:hAnsi="Noto Sans CJK JP" w:eastAsia="Noto Sans CJK JP"/>
           <w:sz w:val="21"/>
         </w:rPr>
-        <w:t>エスプリキ オ アシデンチ コン プレシザォン。クアンド、オンジ、コモ アコンテセウ イ クアウ フォイ ア レザォン</w:t>
+        <w:t>ヴァモス ヴェリフィカール オ デタリャメント メジコ パラ エンテンデール オ トラタメント ヘアリザード</w:t>
       </w:r>
     </w:p>
     <w:p/>
@@ -5647,7 +6721,7 @@
           <w:rFonts w:ascii="Noto Sans CJK JP" w:hAnsi="Noto Sans CJK JP" w:eastAsia="Noto Sans CJK JP"/>
           <w:sz w:val="21"/>
         </w:rPr>
-        <w:t>日本語確認用: 事故状況報告は正確さが重要。</w:t>
+        <w:t>日本語確認用: 診療明細で治療内容を確認する。</w:t>
       </w:r>
     </w:p>
     <w:p/>
@@ -5865,7 +6939,7 @@
           <w:rFonts w:ascii="Noto Sans CJK JP" w:hAnsi="Noto Sans CJK JP" w:eastAsia="Noto Sans CJK JP"/>
           <w:sz w:val="20"/>
         </w:rPr>
-        <w:t>ACC-0036</w:t>
+        <w:t>ACC-0037</w:t>
       </w:r>
     </w:p>
     <w:p>
@@ -5877,7 +6951,7 @@
           <w:rFonts w:ascii="Noto Sans CJK JP" w:hAnsi="Noto Sans CJK JP" w:eastAsia="Noto Sans CJK JP"/>
           <w:sz w:val="20"/>
         </w:rPr>
-        <w:t>ACC-0035</w:t>
+        <w:t>ACC-0006</w:t>
       </w:r>
     </w:p>
     <w:p>
@@ -5889,7 +6963,7 @@
           <w:rFonts w:ascii="Noto Sans CJK JP" w:hAnsi="Noto Sans CJK JP" w:eastAsia="Noto Sans CJK JP"/>
           <w:sz w:val="20"/>
         </w:rPr>
-        <w:t>ACC-0020</w:t>
+        <w:t>ACC-0028</w:t>
       </w:r>
     </w:p>
     <w:p>
@@ -5901,7 +6975,7 @@
           <w:rFonts w:ascii="Noto Sans CJK JP" w:hAnsi="Noto Sans CJK JP" w:eastAsia="Noto Sans CJK JP"/>
           <w:sz w:val="20"/>
         </w:rPr>
-        <w:t>ACC-0004</w:t>
+        <w:t>ACC-0029</w:t>
       </w:r>
     </w:p>
     <w:p/>
@@ -5929,7 +7003,7 @@
           <w:rFonts w:ascii="Noto Sans CJK JP" w:hAnsi="Noto Sans CJK JP" w:eastAsia="Noto Sans CJK JP"/>
           <w:sz w:val="20"/>
         </w:rPr>
-        <w:t>ACC-0036</w:t>
+        <w:t>ACC-0037</w:t>
       </w:r>
     </w:p>
     <w:p>
@@ -5941,7 +7015,7 @@
           <w:rFonts w:ascii="Noto Sans CJK JP" w:hAnsi="Noto Sans CJK JP" w:eastAsia="Noto Sans CJK JP"/>
           <w:sz w:val="20"/>
         </w:rPr>
-        <w:t>ACC-0035</w:t>
+        <w:t>ACC-0006</w:t>
       </w:r>
     </w:p>
     <w:p>
@@ -5953,7 +7027,7 @@
           <w:rFonts w:ascii="Noto Sans CJK JP" w:hAnsi="Noto Sans CJK JP" w:eastAsia="Noto Sans CJK JP"/>
           <w:sz w:val="20"/>
         </w:rPr>
-        <w:t>ACC-0020</w:t>
+        <w:t>ACC-0028</w:t>
       </w:r>
     </w:p>
     <w:p>
@@ -5965,7 +7039,7 @@
           <w:rFonts w:ascii="Noto Sans CJK JP" w:hAnsi="Noto Sans CJK JP" w:eastAsia="Noto Sans CJK JP"/>
           <w:sz w:val="20"/>
         </w:rPr>
-        <w:t>ACC-0004</w:t>
+        <w:t>ACC-0029</w:t>
       </w:r>
     </w:p>
     <w:p>
@@ -5977,7 +7051,7 @@
           <w:rFonts w:ascii="Noto Sans CJK JP" w:hAnsi="Noto Sans CJK JP" w:eastAsia="Noto Sans CJK JP"/>
           <w:sz w:val="20"/>
         </w:rPr>
-        <w:t>FAQ-ACC-0036</w:t>
+        <w:t>FAQ-ACC-0037</w:t>
       </w:r>
     </w:p>
     <w:p/>
@@ -6121,7 +7195,7 @@
           <w:rFonts w:ascii="Noto Sans CJK JP" w:hAnsi="Noto Sans CJK JP" w:eastAsia="Noto Sans CJK JP"/>
           <w:sz w:val="20"/>
         </w:rPr>
-        <w:t>`02_MasterDictionary/ACC/ACC-0036.md`</w:t>
+        <w:t>`02_MasterDictionary/ACC/ACC-0037.md`</w:t>
       </w:r>
     </w:p>
     <w:p>
@@ -6133,7 +7207,7 @@
           <w:rFonts w:ascii="Noto Sans CJK JP" w:hAnsi="Noto Sans CJK JP" w:eastAsia="Noto Sans CJK JP"/>
           <w:sz w:val="20"/>
         </w:rPr>
-        <w:t>`02_MasterDictionary/ACC/ACC-0035.md`</w:t>
+        <w:t>`02_MasterDictionary/ACC/ACC-0006.md`</w:t>
       </w:r>
     </w:p>
     <w:p>
@@ -6145,7 +7219,7 @@
           <w:rFonts w:ascii="Noto Sans CJK JP" w:hAnsi="Noto Sans CJK JP" w:eastAsia="Noto Sans CJK JP"/>
           <w:sz w:val="20"/>
         </w:rPr>
-        <w:t>`02_MasterDictionary/ACC/ACC-0020.md`</w:t>
+        <w:t>`02_MasterDictionary/ACC/ACC-0028.md`</w:t>
       </w:r>
     </w:p>
     <w:p>
@@ -6157,7 +7231,7 @@
           <w:rFonts w:ascii="Noto Sans CJK JP" w:hAnsi="Noto Sans CJK JP" w:eastAsia="Noto Sans CJK JP"/>
           <w:sz w:val="20"/>
         </w:rPr>
-        <w:t>`02_MasterDictionary/ACC/ACC-0004.md`</w:t>
+        <w:t>`02_MasterDictionary/ACC/ACC-0029.md`</w:t>
       </w:r>
     </w:p>
     <w:p/>
@@ -6339,7 +7413,7 @@
           <w:color w:val="1F4E79"/>
           <w:sz w:val="36"/>
         </w:rPr>
-        <w:t>FAQ-ACC-0037 - 診療明細書では何を確認しますか。</w:t>
+        <w:t>FAQ-ACC-0038 - 口座情報を間違えるとどうなりますか。</w:t>
       </w:r>
     </w:p>
     <w:p/>
@@ -6428,7 +7502,7 @@
           <w:rFonts w:ascii="Noto Sans CJK JP" w:hAnsi="Noto Sans CJK JP" w:eastAsia="Noto Sans CJK JP"/>
           <w:sz w:val="21"/>
         </w:rPr>
-        <w:t>FAQ-ACC-0037</w:t>
+        <w:t>FAQ-ACC-0038</w:t>
       </w:r>
     </w:p>
     <w:p/>
@@ -6478,7 +7552,7 @@
           <w:rFonts w:ascii="Noto Sans CJK JP" w:hAnsi="Noto Sans CJK JP" w:eastAsia="Noto Sans CJK JP"/>
           <w:sz w:val="21"/>
         </w:rPr>
-        <w:t>診療明細書では何を確認しますか。</w:t>
+        <w:t>口座情報を間違えるとどうなりますか。</w:t>
       </w:r>
     </w:p>
     <w:p/>
@@ -6506,7 +7580,7 @@
           <w:rFonts w:ascii="Noto Sans CJK JP" w:hAnsi="Noto Sans CJK JP" w:eastAsia="Noto Sans CJK JP"/>
           <w:sz w:val="20"/>
         </w:rPr>
-        <w:t>診療明細書では何を確認しますか。</w:t>
+        <w:t>口座情報を間違えるとどうなりますか。</w:t>
       </w:r>
     </w:p>
     <w:p>
@@ -6555,7 +7629,7 @@
           <w:rFonts w:ascii="Noto Sans CJK JP" w:hAnsi="Noto Sans CJK JP" w:eastAsia="Noto Sans CJK JP"/>
           <w:sz w:val="21"/>
         </w:rPr>
-        <w:t>診療明細書の提出後、何を見られるのか顧客が質問している場面。</w:t>
+        <w:t>保険金受取口座の情報確認が必要な場面。</w:t>
       </w:r>
     </w:p>
     <w:p/>
@@ -6580,7 +7654,7 @@
           <w:rFonts w:ascii="Noto Sans CJK JP" w:hAnsi="Noto Sans CJK JP" w:eastAsia="Noto Sans CJK JP"/>
           <w:sz w:val="21"/>
         </w:rPr>
-        <w:t>診療明細書に記載された診療内容、日数、手術、検査、治療費などを保険金請求上確認することです。</w:t>
+        <w:t>保険金が支払われる場合に、受取口座の名義、番号、金融機関情報などを確認することです。</w:t>
       </w:r>
     </w:p>
     <w:p/>
@@ -6620,7 +7694,7 @@
           <w:rFonts w:ascii="Noto Sans CJK JP" w:hAnsi="Noto Sans CJK JP" w:eastAsia="Noto Sans CJK JP"/>
           <w:sz w:val="21"/>
         </w:rPr>
-        <w:t>Vamos verificar o detalhamento médico para entender o tratamento realizado.</w:t>
+        <w:t>Se o pagamento for aprovado, os dados bancários precisam estar corretos para evitar atraso.</w:t>
       </w:r>
     </w:p>
     <w:p/>
@@ -6645,7 +7719,7 @@
           <w:rFonts w:ascii="Noto Sans CJK JP" w:hAnsi="Noto Sans CJK JP" w:eastAsia="Noto Sans CJK JP"/>
           <w:sz w:val="21"/>
         </w:rPr>
-        <w:t>ヴァモス ヴェリフィカール オ デタリャメント メジコ パラ エンテンデール オ トラタメント ヘアリザード</w:t>
+        <w:t>セ オ パガメント フォール アプロヴァード、オス ダドス バンカリオス プレシザン エスタール コヘトス パラ エヴィタール アトラゾ</w:t>
       </w:r>
     </w:p>
     <w:p/>
@@ -6655,1015 +7729,7 @@
           <w:rFonts w:ascii="Noto Sans CJK JP" w:hAnsi="Noto Sans CJK JP" w:eastAsia="Noto Sans CJK JP"/>
           <w:sz w:val="21"/>
         </w:rPr>
-        <w:t>日本語確認用: 診療明細で治療内容を確認する。</w:t>
-      </w:r>
-    </w:p>
-    <w:p/>
-    <w:p>
-      <w:pPr>
-        <w:pStyle w:val="Heading2"/>
-      </w:pPr>
-      <w:r>
-        <w:rPr>
-          <w:rFonts w:ascii="Noto Sans CJK JP" w:hAnsi="Noto Sans CJK JP" w:eastAsia="Noto Sans CJK JP"/>
-          <w:b/>
-          <w:color w:val="2F5496"/>
-          <w:sz w:val="28"/>
-        </w:rPr>
-        <w:t>顧客への次の一言</w:t>
-      </w:r>
-    </w:p>
-    <w:p/>
-    <w:p>
-      <w:pPr>
-        <w:pStyle w:val="Heading3"/>
-      </w:pPr>
-      <w:r>
-        <w:rPr>
-          <w:rFonts w:ascii="Noto Sans CJK JP" w:hAnsi="Noto Sans CJK JP" w:eastAsia="Noto Sans CJK JP"/>
-          <w:b/>
-          <w:color w:val="595959"/>
-          <w:sz w:val="24"/>
-        </w:rPr>
-        <w:t>ポルトガル語で伝える内容</w:t>
-      </w:r>
-    </w:p>
-    <w:p/>
-    <w:p>
-      <w:r>
-        <w:rPr>
-          <w:rFonts w:ascii="Noto Sans CJK JP" w:hAnsi="Noto Sans CJK JP" w:eastAsia="Noto Sans CJK JP"/>
-          <w:sz w:val="21"/>
-        </w:rPr>
-        <w:t>Vou confirmar a orientação oficial da seguradora antes de responder com segurança.</w:t>
-      </w:r>
-    </w:p>
-    <w:p/>
-    <w:p>
-      <w:pPr>
-        <w:pStyle w:val="Heading3"/>
-      </w:pPr>
-      <w:r>
-        <w:rPr>
-          <w:rFonts w:ascii="Noto Sans CJK JP" w:hAnsi="Noto Sans CJK JP" w:eastAsia="Noto Sans CJK JP"/>
-          <w:b/>
-          <w:color w:val="595959"/>
-          <w:sz w:val="24"/>
-        </w:rPr>
-        <w:t>カタカナ読み</w:t>
-      </w:r>
-    </w:p>
-    <w:p/>
-    <w:p>
-      <w:r>
-        <w:rPr>
-          <w:rFonts w:ascii="Noto Sans CJK JP" w:hAnsi="Noto Sans CJK JP" w:eastAsia="Noto Sans CJK JP"/>
-          <w:sz w:val="21"/>
-        </w:rPr>
-        <w:t>ヴォウ コンフィルマール ア オリエンタサォン オフィシアウ ダ セグラドーラ アンチス ジ ヘスポンデール コン セグランサ</w:t>
-      </w:r>
-    </w:p>
-    <w:p/>
-    <w:p>
-      <w:r>
-        <w:rPr>
-          <w:rFonts w:ascii="Noto Sans CJK JP" w:hAnsi="Noto Sans CJK JP" w:eastAsia="Noto Sans CJK JP"/>
-          <w:sz w:val="21"/>
-        </w:rPr>
-        <w:t>日本語確認用: 断定せず、保険会社の正式案内を確認してから回答する。</w:t>
-      </w:r>
-    </w:p>
-    <w:p/>
-    <w:p>
-      <w:pPr>
-        <w:pStyle w:val="Heading2"/>
-      </w:pPr>
-      <w:r>
-        <w:rPr>
-          <w:rFonts w:ascii="Noto Sans CJK JP" w:hAnsi="Noto Sans CJK JP" w:eastAsia="Noto Sans CJK JP"/>
-          <w:b/>
-          <w:color w:val="2F5496"/>
-          <w:sz w:val="28"/>
-        </w:rPr>
-        <w:t>想定される反論</w:t>
-      </w:r>
-    </w:p>
-    <w:p/>
-    <w:p>
-      <w:pPr>
-        <w:pStyle w:val="Heading3"/>
-      </w:pPr>
-      <w:r>
-        <w:rPr>
-          <w:rFonts w:ascii="Noto Sans CJK JP" w:hAnsi="Noto Sans CJK JP" w:eastAsia="Noto Sans CJK JP"/>
-          <w:b/>
-          <w:color w:val="595959"/>
-          <w:sz w:val="24"/>
-        </w:rPr>
-        <w:t>顧客が言いそうなこと</w:t>
-      </w:r>
-    </w:p>
-    <w:p/>
-    <w:p>
-      <w:r>
-        <w:rPr>
-          <w:rFonts w:ascii="Noto Sans CJK JP" w:hAnsi="Noto Sans CJK JP" w:eastAsia="Noto Sans CJK JP"/>
-          <w:sz w:val="21"/>
-        </w:rPr>
-        <w:t>Mas eu preciso de uma resposta agora.</w:t>
-      </w:r>
-    </w:p>
-    <w:p/>
-    <w:p>
-      <w:pPr>
-        <w:pStyle w:val="Heading3"/>
-      </w:pPr>
-      <w:r>
-        <w:rPr>
-          <w:rFonts w:ascii="Noto Sans CJK JP" w:hAnsi="Noto Sans CJK JP" w:eastAsia="Noto Sans CJK JP"/>
-          <w:b/>
-          <w:color w:val="595959"/>
-          <w:sz w:val="24"/>
-        </w:rPr>
-        <w:t>安全なポルトガル語回答</w:t>
-      </w:r>
-    </w:p>
-    <w:p/>
-    <w:p>
-      <w:r>
-        <w:rPr>
-          <w:rFonts w:ascii="Noto Sans CJK JP" w:hAnsi="Noto Sans CJK JP" w:eastAsia="Noto Sans CJK JP"/>
-          <w:sz w:val="21"/>
-        </w:rPr>
-        <w:t>Entendo. Para evitar uma informação errada, preciso confirmar com a seguradora antes de responder.</w:t>
-      </w:r>
-    </w:p>
-    <w:p/>
-    <w:p>
-      <w:pPr>
-        <w:pStyle w:val="Heading2"/>
-      </w:pPr>
-      <w:r>
-        <w:rPr>
-          <w:rFonts w:ascii="Noto Sans CJK JP" w:hAnsi="Noto Sans CJK JP" w:eastAsia="Noto Sans CJK JP"/>
-          <w:b/>
-          <w:color w:val="2F5496"/>
-          <w:sz w:val="28"/>
-        </w:rPr>
-        <w:t>安全な次のステップ</w:t>
-      </w:r>
-    </w:p>
-    <w:p/>
-    <w:p>
-      <w:r>
-        <w:rPr>
-          <w:rFonts w:ascii="Noto Sans CJK JP" w:hAnsi="Noto Sans CJK JP" w:eastAsia="Noto Sans CJK JP"/>
-          <w:sz w:val="21"/>
-        </w:rPr>
-        <w:t>保険証券、事故状況、提出書類、保険会社からの通知、追加依頼の有無を確認する。</w:t>
-      </w:r>
-    </w:p>
-    <w:p/>
-    <w:p>
-      <w:pPr>
-        <w:pStyle w:val="Heading2"/>
-      </w:pPr>
-      <w:r>
-        <w:rPr>
-          <w:rFonts w:ascii="Noto Sans CJK JP" w:hAnsi="Noto Sans CJK JP" w:eastAsia="Noto Sans CJK JP"/>
-          <w:b/>
-          <w:color w:val="2F5496"/>
-          <w:sz w:val="28"/>
-        </w:rPr>
-        <w:t>コンプライアンス上の注意</w:t>
-      </w:r>
-    </w:p>
-    <w:p/>
-    <w:p>
-      <w:r>
-        <w:rPr>
-          <w:rFonts w:ascii="Noto Sans CJK JP" w:hAnsi="Noto Sans CJK JP" w:eastAsia="Noto Sans CJK JP"/>
-          <w:sz w:val="21"/>
-        </w:rPr>
-        <w:t>このFAQは受付と説明の補助であり、支払可否、支払金額、支払時期、補償、免責該当性、受取可否を断定しない。最終判断は契約条件、事故状況、提出書類、公的制度および保険会社の査定による。</w:t>
-      </w:r>
-    </w:p>
-    <w:p/>
-    <w:p>
-      <w:pPr>
-        <w:pStyle w:val="Heading2"/>
-      </w:pPr>
-      <w:r>
-        <w:rPr>
-          <w:rFonts w:ascii="Noto Sans CJK JP" w:hAnsi="Noto Sans CJK JP" w:eastAsia="Noto Sans CJK JP"/>
-          <w:b/>
-          <w:color w:val="2F5496"/>
-          <w:sz w:val="28"/>
-        </w:rPr>
-        <w:t>関連用語</w:t>
-      </w:r>
-    </w:p>
-    <w:p/>
-    <w:p>
-      <w:pPr>
-        <w:pStyle w:val="ListBullet"/>
-      </w:pPr>
-      <w:r>
-        <w:rPr>
-          <w:rFonts w:ascii="Noto Sans CJK JP" w:hAnsi="Noto Sans CJK JP" w:eastAsia="Noto Sans CJK JP"/>
-          <w:sz w:val="20"/>
-        </w:rPr>
-        <w:t>ACC-0037</w:t>
-      </w:r>
-    </w:p>
-    <w:p>
-      <w:pPr>
-        <w:pStyle w:val="ListBullet"/>
-      </w:pPr>
-      <w:r>
-        <w:rPr>
-          <w:rFonts w:ascii="Noto Sans CJK JP" w:hAnsi="Noto Sans CJK JP" w:eastAsia="Noto Sans CJK JP"/>
-          <w:sz w:val="20"/>
-        </w:rPr>
-        <w:t>ACC-0006</w:t>
-      </w:r>
-    </w:p>
-    <w:p>
-      <w:pPr>
-        <w:pStyle w:val="ListBullet"/>
-      </w:pPr>
-      <w:r>
-        <w:rPr>
-          <w:rFonts w:ascii="Noto Sans CJK JP" w:hAnsi="Noto Sans CJK JP" w:eastAsia="Noto Sans CJK JP"/>
-          <w:sz w:val="20"/>
-        </w:rPr>
-        <w:t>ACC-0028</w:t>
-      </w:r>
-    </w:p>
-    <w:p>
-      <w:pPr>
-        <w:pStyle w:val="ListBullet"/>
-      </w:pPr>
-      <w:r>
-        <w:rPr>
-          <w:rFonts w:ascii="Noto Sans CJK JP" w:hAnsi="Noto Sans CJK JP" w:eastAsia="Noto Sans CJK JP"/>
-          <w:sz w:val="20"/>
-        </w:rPr>
-        <w:t>ACC-0029</w:t>
-      </w:r>
-    </w:p>
-    <w:p/>
-    <w:p>
-      <w:pPr>
-        <w:pStyle w:val="Heading2"/>
-      </w:pPr>
-      <w:r>
-        <w:rPr>
-          <w:rFonts w:ascii="Noto Sans CJK JP" w:hAnsi="Noto Sans CJK JP" w:eastAsia="Noto Sans CJK JP"/>
-          <w:b/>
-          <w:color w:val="2F5496"/>
-          <w:sz w:val="28"/>
-        </w:rPr>
-        <w:t>相互参照</w:t>
-      </w:r>
-    </w:p>
-    <w:p/>
-    <w:p>
-      <w:pPr>
-        <w:pStyle w:val="ListBullet"/>
-      </w:pPr>
-      <w:r>
-        <w:rPr>
-          <w:rFonts w:ascii="Noto Sans CJK JP" w:hAnsi="Noto Sans CJK JP" w:eastAsia="Noto Sans CJK JP"/>
-          <w:sz w:val="20"/>
-        </w:rPr>
-        <w:t>ACC-0037</w:t>
-      </w:r>
-    </w:p>
-    <w:p>
-      <w:pPr>
-        <w:pStyle w:val="ListBullet"/>
-      </w:pPr>
-      <w:r>
-        <w:rPr>
-          <w:rFonts w:ascii="Noto Sans CJK JP" w:hAnsi="Noto Sans CJK JP" w:eastAsia="Noto Sans CJK JP"/>
-          <w:sz w:val="20"/>
-        </w:rPr>
-        <w:t>ACC-0006</w:t>
-      </w:r>
-    </w:p>
-    <w:p>
-      <w:pPr>
-        <w:pStyle w:val="ListBullet"/>
-      </w:pPr>
-      <w:r>
-        <w:rPr>
-          <w:rFonts w:ascii="Noto Sans CJK JP" w:hAnsi="Noto Sans CJK JP" w:eastAsia="Noto Sans CJK JP"/>
-          <w:sz w:val="20"/>
-        </w:rPr>
-        <w:t>ACC-0028</w:t>
-      </w:r>
-    </w:p>
-    <w:p>
-      <w:pPr>
-        <w:pStyle w:val="ListBullet"/>
-      </w:pPr>
-      <w:r>
-        <w:rPr>
-          <w:rFonts w:ascii="Noto Sans CJK JP" w:hAnsi="Noto Sans CJK JP" w:eastAsia="Noto Sans CJK JP"/>
-          <w:sz w:val="20"/>
-        </w:rPr>
-        <w:t>ACC-0029</w:t>
-      </w:r>
-    </w:p>
-    <w:p>
-      <w:pPr>
-        <w:pStyle w:val="ListBullet"/>
-      </w:pPr>
-      <w:r>
-        <w:rPr>
-          <w:rFonts w:ascii="Noto Sans CJK JP" w:hAnsi="Noto Sans CJK JP" w:eastAsia="Noto Sans CJK JP"/>
-          <w:sz w:val="20"/>
-        </w:rPr>
-        <w:t>FAQ-ACC-0037</w:t>
-      </w:r>
-    </w:p>
-    <w:p/>
-    <w:p>
-      <w:pPr>
-        <w:pStyle w:val="Heading2"/>
-      </w:pPr>
-      <w:r>
-        <w:rPr>
-          <w:rFonts w:ascii="Noto Sans CJK JP" w:hAnsi="Noto Sans CJK JP" w:eastAsia="Noto Sans CJK JP"/>
-          <w:b/>
-          <w:color w:val="2F5496"/>
-          <w:sz w:val="28"/>
-        </w:rPr>
-        <w:t>参考資料</w:t>
-      </w:r>
-    </w:p>
-    <w:p/>
-    <w:p>
-      <w:pPr>
-        <w:pStyle w:val="ListBullet"/>
-      </w:pPr>
-      <w:r>
-        <w:rPr>
-          <w:rFonts w:ascii="Noto Sans CJK JP" w:hAnsi="Noto Sans CJK JP" w:eastAsia="Noto Sans CJK JP"/>
-          <w:sz w:val="20"/>
-        </w:rPr>
-        <w:t>Documento interno: `16_NotebookLM/ACC_NOTEBOOKLM_PACK_0001.md`</w:t>
-      </w:r>
-    </w:p>
-    <w:p>
-      <w:pPr>
-        <w:pStyle w:val="ListBullet"/>
-      </w:pPr>
-      <w:r>
-        <w:rPr>
-          <w:rFonts w:ascii="Noto Sans CJK JP" w:hAnsi="Noto Sans CJK JP" w:eastAsia="Noto Sans CJK JP"/>
-          <w:sz w:val="20"/>
-        </w:rPr>
-        <w:t>Documento interno: `10_Accident/ACC_NAVIGATION_GUIDE.md`</w:t>
-      </w:r>
-    </w:p>
-    <w:p/>
-    <w:p>
-      <w:pPr>
-        <w:pStyle w:val="Heading2"/>
-      </w:pPr>
-      <w:r>
-        <w:rPr>
-          <w:rFonts w:ascii="Noto Sans CJK JP" w:hAnsi="Noto Sans CJK JP" w:eastAsia="Noto Sans CJK JP"/>
-          <w:b/>
-          <w:color w:val="2F5496"/>
-          <w:sz w:val="28"/>
-        </w:rPr>
-        <w:t>タグ</w:t>
-      </w:r>
-    </w:p>
-    <w:p/>
-    <w:p>
-      <w:pPr>
-        <w:pStyle w:val="ListBullet"/>
-      </w:pPr>
-      <w:r>
-        <w:rPr>
-          <w:rFonts w:ascii="Noto Sans CJK JP" w:hAnsi="Noto Sans CJK JP" w:eastAsia="Noto Sans CJK JP"/>
-          <w:sz w:val="20"/>
-        </w:rPr>
-        <w:t>faq</w:t>
-      </w:r>
-    </w:p>
-    <w:p>
-      <w:pPr>
-        <w:pStyle w:val="ListBullet"/>
-      </w:pPr>
-      <w:r>
-        <w:rPr>
-          <w:rFonts w:ascii="Noto Sans CJK JP" w:hAnsi="Noto Sans CJK JP" w:eastAsia="Noto Sans CJK JP"/>
-          <w:sz w:val="20"/>
-        </w:rPr>
-        <w:t>acc</w:t>
-      </w:r>
-    </w:p>
-    <w:p>
-      <w:pPr>
-        <w:pStyle w:val="ListBullet"/>
-      </w:pPr>
-      <w:r>
-        <w:rPr>
-          <w:rFonts w:ascii="Noto Sans CJK JP" w:hAnsi="Noto Sans CJK JP" w:eastAsia="Noto Sans CJK JP"/>
-          <w:sz w:val="20"/>
-        </w:rPr>
-        <w:t>atendimento</w:t>
-      </w:r>
-    </w:p>
-    <w:p>
-      <w:pPr>
-        <w:pStyle w:val="ListBullet"/>
-      </w:pPr>
-      <w:r>
-        <w:rPr>
-          <w:rFonts w:ascii="Noto Sans CJK JP" w:hAnsi="Noto Sans CJK JP" w:eastAsia="Noto Sans CJK JP"/>
-          <w:sz w:val="20"/>
-        </w:rPr>
-        <w:t>sinistro</w:t>
-      </w:r>
-    </w:p>
-    <w:p>
-      <w:pPr>
-        <w:pStyle w:val="ListBullet"/>
-      </w:pPr>
-      <w:r>
-        <w:rPr>
-          <w:rFonts w:ascii="Noto Sans CJK JP" w:hAnsi="Noto Sans CJK JP" w:eastAsia="Noto Sans CJK JP"/>
-          <w:sz w:val="20"/>
-        </w:rPr>
-        <w:t>compliance</w:t>
-      </w:r>
-    </w:p>
-    <w:p/>
-    <w:p>
-      <w:pPr>
-        <w:pStyle w:val="Heading2"/>
-      </w:pPr>
-      <w:r>
-        <w:rPr>
-          <w:rFonts w:ascii="Noto Sans CJK JP" w:hAnsi="Noto Sans CJK JP" w:eastAsia="Noto Sans CJK JP"/>
-          <w:b/>
-          <w:color w:val="2F5496"/>
-          <w:sz w:val="28"/>
-        </w:rPr>
-        <w:t>関連項目</w:t>
-      </w:r>
-    </w:p>
-    <w:p/>
-    <w:p>
-      <w:pPr>
-        <w:pStyle w:val="ListBullet"/>
-      </w:pPr>
-      <w:r>
-        <w:rPr>
-          <w:rFonts w:ascii="Noto Sans CJK JP" w:hAnsi="Noto Sans CJK JP" w:eastAsia="Noto Sans CJK JP"/>
-          <w:sz w:val="20"/>
-        </w:rPr>
-        <w:t>`02_MasterDictionary/ACC/ACC-0037.md`</w:t>
-      </w:r>
-    </w:p>
-    <w:p>
-      <w:pPr>
-        <w:pStyle w:val="ListBullet"/>
-      </w:pPr>
-      <w:r>
-        <w:rPr>
-          <w:rFonts w:ascii="Noto Sans CJK JP" w:hAnsi="Noto Sans CJK JP" w:eastAsia="Noto Sans CJK JP"/>
-          <w:sz w:val="20"/>
-        </w:rPr>
-        <w:t>`02_MasterDictionary/ACC/ACC-0006.md`</w:t>
-      </w:r>
-    </w:p>
-    <w:p>
-      <w:pPr>
-        <w:pStyle w:val="ListBullet"/>
-      </w:pPr>
-      <w:r>
-        <w:rPr>
-          <w:rFonts w:ascii="Noto Sans CJK JP" w:hAnsi="Noto Sans CJK JP" w:eastAsia="Noto Sans CJK JP"/>
-          <w:sz w:val="20"/>
-        </w:rPr>
-        <w:t>`02_MasterDictionary/ACC/ACC-0028.md`</w:t>
-      </w:r>
-    </w:p>
-    <w:p>
-      <w:pPr>
-        <w:pStyle w:val="ListBullet"/>
-      </w:pPr>
-      <w:r>
-        <w:rPr>
-          <w:rFonts w:ascii="Noto Sans CJK JP" w:hAnsi="Noto Sans CJK JP" w:eastAsia="Noto Sans CJK JP"/>
-          <w:sz w:val="20"/>
-        </w:rPr>
-        <w:t>`02_MasterDictionary/ACC/ACC-0029.md`</w:t>
-      </w:r>
-    </w:p>
-    <w:p/>
-    <w:p>
-      <w:pPr>
-        <w:pStyle w:val="Heading2"/>
-      </w:pPr>
-      <w:r>
-        <w:rPr>
-          <w:rFonts w:ascii="Noto Sans CJK JP" w:hAnsi="Noto Sans CJK JP" w:eastAsia="Noto Sans CJK JP"/>
-          <w:b/>
-          <w:color w:val="2F5496"/>
-          <w:sz w:val="28"/>
-        </w:rPr>
-        <w:t>改訂履歴</w:t>
-      </w:r>
-    </w:p>
-    <w:p/>
-    <w:tbl>
-      <w:tblPr>
-        <w:tblStyle w:val="TableGrid"/>
-        <w:tblW w:type="auto" w:w="0"/>
-        <w:tblLook w:firstColumn="1" w:firstRow="1" w:lastColumn="0" w:lastRow="0" w:noHBand="0" w:noVBand="1" w:val="04A0"/>
-      </w:tblPr>
-      <w:tblGrid>
-        <w:gridCol w:w="2556"/>
-        <w:gridCol w:w="2556"/>
-        <w:gridCol w:w="2556"/>
-        <w:gridCol w:w="2556"/>
-      </w:tblGrid>
-      <w:tr>
-        <w:tc>
-          <w:tcPr>
-            <w:tcW w:type="dxa" w:w="2556"/>
-          </w:tcPr>
-          <w:p>
-            <w:r/>
-            <w:r>
-              <w:rPr>
-                <w:rFonts w:ascii="Noto Sans CJK JP" w:hAnsi="Noto Sans CJK JP" w:eastAsia="Noto Sans CJK JP"/>
-                <w:b/>
-                <w:sz w:val="18"/>
-              </w:rPr>
-              <w:t>Data</w:t>
-            </w:r>
-          </w:p>
-        </w:tc>
-        <w:tc>
-          <w:tcPr>
-            <w:tcW w:type="dxa" w:w="2556"/>
-          </w:tcPr>
-          <w:p>
-            <w:r/>
-            <w:r>
-              <w:rPr>
-                <w:rFonts w:ascii="Noto Sans CJK JP" w:hAnsi="Noto Sans CJK JP" w:eastAsia="Noto Sans CJK JP"/>
-                <w:b/>
-                <w:sz w:val="18"/>
-              </w:rPr>
-              <w:t>Versão</w:t>
-            </w:r>
-          </w:p>
-        </w:tc>
-        <w:tc>
-          <w:tcPr>
-            <w:tcW w:type="dxa" w:w="2556"/>
-          </w:tcPr>
-          <w:p>
-            <w:r/>
-            <w:r>
-              <w:rPr>
-                <w:rFonts w:ascii="Noto Sans CJK JP" w:hAnsi="Noto Sans CJK JP" w:eastAsia="Noto Sans CJK JP"/>
-                <w:b/>
-                <w:sz w:val="18"/>
-              </w:rPr>
-              <w:t>Autor</w:t>
-            </w:r>
-          </w:p>
-        </w:tc>
-        <w:tc>
-          <w:tcPr>
-            <w:tcW w:type="dxa" w:w="2556"/>
-          </w:tcPr>
-          <w:p>
-            <w:r/>
-            <w:r>
-              <w:rPr>
-                <w:rFonts w:ascii="Noto Sans CJK JP" w:hAnsi="Noto Sans CJK JP" w:eastAsia="Noto Sans CJK JP"/>
-                <w:b/>
-                <w:sz w:val="18"/>
-              </w:rPr>
-              <w:t>Alteração</w:t>
-            </w:r>
-          </w:p>
-        </w:tc>
-      </w:tr>
-      <w:tr>
-        <w:tc>
-          <w:tcPr>
-            <w:tcW w:type="dxa" w:w="2556"/>
-          </w:tcPr>
-          <w:p>
-            <w:r/>
-            <w:r>
-              <w:rPr>
-                <w:rFonts w:ascii="Noto Sans CJK JP" w:hAnsi="Noto Sans CJK JP" w:eastAsia="Noto Sans CJK JP"/>
-                <w:b w:val="0"/>
-                <w:sz w:val="18"/>
-              </w:rPr>
-              <w:t>2026-06-30</w:t>
-            </w:r>
-          </w:p>
-        </w:tc>
-        <w:tc>
-          <w:tcPr>
-            <w:tcW w:type="dxa" w:w="2556"/>
-          </w:tcPr>
-          <w:p>
-            <w:r/>
-            <w:r>
-              <w:rPr>
-                <w:rFonts w:ascii="Noto Sans CJK JP" w:hAnsi="Noto Sans CJK JP" w:eastAsia="Noto Sans CJK JP"/>
-                <w:b w:val="0"/>
-                <w:sz w:val="18"/>
-              </w:rPr>
-              <w:t>0.1</w:t>
-            </w:r>
-          </w:p>
-        </w:tc>
-        <w:tc>
-          <w:tcPr>
-            <w:tcW w:type="dxa" w:w="2556"/>
-          </w:tcPr>
-          <w:p>
-            <w:r/>
-            <w:r>
-              <w:rPr>
-                <w:rFonts w:ascii="Noto Sans CJK JP" w:hAnsi="Noto Sans CJK JP" w:eastAsia="Noto Sans CJK JP"/>
-                <w:b w:val="0"/>
-                <w:sz w:val="18"/>
-              </w:rPr>
-              <w:t>JP-BR Insurance Knowledge Base</w:t>
-            </w:r>
-          </w:p>
-        </w:tc>
-        <w:tc>
-          <w:tcPr>
-            <w:tcW w:type="dxa" w:w="2556"/>
-          </w:tcPr>
-          <w:p>
-            <w:r/>
-            <w:r>
-              <w:rPr>
-                <w:rFonts w:ascii="Noto Sans CJK JP" w:hAnsi="Noto Sans CJK JP" w:eastAsia="Noto Sans CJK JP"/>
-                <w:b w:val="0"/>
-                <w:sz w:val="18"/>
-              </w:rPr>
-              <w:t>Criação inicial.</w:t>
-            </w:r>
-          </w:p>
-        </w:tc>
-      </w:tr>
-    </w:tbl>
-    <w:p/>
-    <w:p>
-      <w:r>
-        <w:br w:type="page"/>
-      </w:r>
-    </w:p>
-    <w:p/>
-    <w:p>
-      <w:pPr>
-        <w:pStyle w:val="Heading1"/>
-      </w:pPr>
-      <w:r>
-        <w:rPr>
-          <w:rFonts w:ascii="Noto Sans CJK JP" w:hAnsi="Noto Sans CJK JP" w:eastAsia="Noto Sans CJK JP"/>
-          <w:b/>
-          <w:color w:val="1F4E79"/>
-          <w:sz w:val="36"/>
-        </w:rPr>
-        <w:t>FAQ-ACC-0038 - 口座情報を間違えるとどうなりますか。</w:t>
-      </w:r>
-    </w:p>
-    <w:p/>
-    <w:p>
-      <w:pPr>
-        <w:pStyle w:val="Heading2"/>
-      </w:pPr>
-      <w:r>
-        <w:rPr>
-          <w:rFonts w:ascii="Noto Sans CJK JP" w:hAnsi="Noto Sans CJK JP" w:eastAsia="Noto Sans CJK JP"/>
-          <w:b/>
-          <w:color w:val="2F5496"/>
-          <w:sz w:val="28"/>
-        </w:rPr>
-        <w:t>管理情報</w:t>
-      </w:r>
-    </w:p>
-    <w:p/>
-    <w:p>
-      <w:pPr>
-        <w:pStyle w:val="ListBullet"/>
-      </w:pPr>
-      <w:r>
-        <w:rPr>
-          <w:rFonts w:ascii="Noto Sans CJK JP" w:hAnsi="Noto Sans CJK JP" w:eastAsia="Noto Sans CJK JP"/>
-          <w:sz w:val="20"/>
-        </w:rPr>
-        <w:t>Versão: 0.1</w:t>
-      </w:r>
-    </w:p>
-    <w:p>
-      <w:pPr>
-        <w:pStyle w:val="ListBullet"/>
-      </w:pPr>
-      <w:r>
-        <w:rPr>
-          <w:rFonts w:ascii="Noto Sans CJK JP" w:hAnsi="Noto Sans CJK JP" w:eastAsia="Noto Sans CJK JP"/>
-          <w:sz w:val="20"/>
-        </w:rPr>
-        <w:t>Data: 2026-06-30</w:t>
-      </w:r>
-    </w:p>
-    <w:p>
-      <w:pPr>
-        <w:pStyle w:val="ListBullet"/>
-      </w:pPr>
-      <w:r>
-        <w:rPr>
-          <w:rFonts w:ascii="Noto Sans CJK JP" w:hAnsi="Noto Sans CJK JP" w:eastAsia="Noto Sans CJK JP"/>
-          <w:sz w:val="20"/>
-        </w:rPr>
-        <w:t>Autor: JP-BR Insurance Knowledge Base</w:t>
-      </w:r>
-    </w:p>
-    <w:p>
-      <w:pPr>
-        <w:pStyle w:val="ListBullet"/>
-      </w:pPr>
-      <w:r>
-        <w:rPr>
-          <w:rFonts w:ascii="Noto Sans CJK JP" w:hAnsi="Noto Sans CJK JP" w:eastAsia="Noto Sans CJK JP"/>
-          <w:sz w:val="20"/>
-        </w:rPr>
-        <w:t>Histórico: Criação inicial do quinto lote ACC, com foco em acompanhamento de sinistro e comunicação segura.</w:t>
-      </w:r>
-    </w:p>
-    <w:p/>
-    <w:p>
-      <w:pPr>
-        <w:pStyle w:val="Heading2"/>
-      </w:pPr>
-      <w:r>
-        <w:rPr>
-          <w:rFonts w:ascii="Noto Sans CJK JP" w:hAnsi="Noto Sans CJK JP" w:eastAsia="Noto Sans CJK JP"/>
-          <w:b/>
-          <w:color w:val="2F5496"/>
-          <w:sz w:val="28"/>
-        </w:rPr>
-        <w:t>コード</w:t>
-      </w:r>
-    </w:p>
-    <w:p/>
-    <w:p>
-      <w:r>
-        <w:rPr>
-          <w:rFonts w:ascii="Noto Sans CJK JP" w:hAnsi="Noto Sans CJK JP" w:eastAsia="Noto Sans CJK JP"/>
-          <w:sz w:val="21"/>
-        </w:rPr>
-        <w:t>FAQ-ACC-0038</w:t>
-      </w:r>
-    </w:p>
-    <w:p/>
-    <w:p>
-      <w:pPr>
-        <w:pStyle w:val="Heading2"/>
-      </w:pPr>
-      <w:r>
-        <w:rPr>
-          <w:rFonts w:ascii="Noto Sans CJK JP" w:hAnsi="Noto Sans CJK JP" w:eastAsia="Noto Sans CJK JP"/>
-          <w:b/>
-          <w:color w:val="2F5496"/>
-          <w:sz w:val="28"/>
-        </w:rPr>
-        <w:t>カテゴリー</w:t>
-      </w:r>
-    </w:p>
-    <w:p/>
-    <w:p>
-      <w:r>
-        <w:rPr>
-          <w:rFonts w:ascii="Noto Sans CJK JP" w:hAnsi="Noto Sans CJK JP" w:eastAsia="Noto Sans CJK JP"/>
-          <w:sz w:val="21"/>
-        </w:rPr>
-        <w:t>ACC</w:t>
-      </w:r>
-    </w:p>
-    <w:p/>
-    <w:p>
-      <w:pPr>
-        <w:pStyle w:val="Heading2"/>
-      </w:pPr>
-      <w:r>
-        <w:rPr>
-          <w:rFonts w:ascii="Noto Sans CJK JP" w:hAnsi="Noto Sans CJK JP" w:eastAsia="Noto Sans CJK JP"/>
-          <w:b/>
-          <w:color w:val="2F5496"/>
-          <w:sz w:val="28"/>
-        </w:rPr>
-        <w:t>質問</w:t>
-      </w:r>
-    </w:p>
-    <w:p/>
-    <w:p>
-      <w:r>
-        <w:rPr>
-          <w:rFonts w:ascii="Noto Sans CJK JP" w:hAnsi="Noto Sans CJK JP" w:eastAsia="Noto Sans CJK JP"/>
-          <w:sz w:val="21"/>
-        </w:rPr>
-        <w:t>口座情報を間違えるとどうなりますか。</w:t>
-      </w:r>
-    </w:p>
-    <w:p/>
-    <w:p>
-      <w:pPr>
-        <w:pStyle w:val="Heading2"/>
-      </w:pPr>
-      <w:r>
-        <w:rPr>
-          <w:rFonts w:ascii="Noto Sans CJK JP" w:hAnsi="Noto Sans CJK JP" w:eastAsia="Noto Sans CJK JP"/>
-          <w:b/>
-          <w:color w:val="2F5496"/>
-          <w:sz w:val="28"/>
-        </w:rPr>
-        <w:t>日本語での自然な検索</w:t>
-      </w:r>
-    </w:p>
-    <w:p/>
-    <w:p>
-      <w:pPr>
-        <w:pStyle w:val="ListBullet"/>
-      </w:pPr>
-      <w:r>
-        <w:rPr>
-          <w:rFonts w:ascii="Noto Sans CJK JP" w:hAnsi="Noto Sans CJK JP" w:eastAsia="Noto Sans CJK JP"/>
-          <w:sz w:val="20"/>
-        </w:rPr>
-        <w:t>口座情報を間違えるとどうなりますか。</w:t>
-      </w:r>
-    </w:p>
-    <w:p>
-      <w:pPr>
-        <w:pStyle w:val="ListBullet"/>
-      </w:pPr>
-      <w:r>
-        <w:rPr>
-          <w:rFonts w:ascii="Noto Sans CJK JP" w:hAnsi="Noto Sans CJK JP" w:eastAsia="Noto Sans CJK JP"/>
-          <w:sz w:val="20"/>
-        </w:rPr>
-        <w:t>ブラジル人のお客様にこの事故対応をどう説明しますか。</w:t>
-      </w:r>
-    </w:p>
-    <w:p>
-      <w:pPr>
-        <w:pStyle w:val="ListBullet"/>
-      </w:pPr>
-      <w:r>
-        <w:rPr>
-          <w:rFonts w:ascii="Noto Sans CJK JP" w:hAnsi="Noto Sans CJK JP" w:eastAsia="Noto Sans CJK JP"/>
-          <w:sz w:val="20"/>
-        </w:rPr>
-        <w:t>保険会社の正式案内を待つ説明を確認したいです。</w:t>
-      </w:r>
-    </w:p>
-    <w:p/>
-    <w:p>
-      <w:pPr>
-        <w:pStyle w:val="Heading2"/>
-      </w:pPr>
-      <w:r>
-        <w:rPr>
-          <w:rFonts w:ascii="Noto Sans CJK JP" w:hAnsi="Noto Sans CJK JP" w:eastAsia="Noto Sans CJK JP"/>
-          <w:b/>
-          <w:color w:val="2F5496"/>
-          <w:sz w:val="28"/>
-        </w:rPr>
-        <w:t>対応場面</w:t>
-      </w:r>
-    </w:p>
-    <w:p/>
-    <w:p>
-      <w:r>
-        <w:rPr>
-          <w:rFonts w:ascii="Noto Sans CJK JP" w:hAnsi="Noto Sans CJK JP" w:eastAsia="Noto Sans CJK JP"/>
-          <w:sz w:val="21"/>
-        </w:rPr>
-        <w:t>保険金受取口座の情報確認が必要な場面。</w:t>
-      </w:r>
-    </w:p>
-    <w:p/>
-    <w:p>
-      <w:pPr>
-        <w:pStyle w:val="Heading2"/>
-      </w:pPr>
-      <w:r>
-        <w:rPr>
-          <w:rFonts w:ascii="Noto Sans CJK JP" w:hAnsi="Noto Sans CJK JP" w:eastAsia="Noto Sans CJK JP"/>
-          <w:b/>
-          <w:color w:val="2F5496"/>
-          <w:sz w:val="28"/>
-        </w:rPr>
-        <w:t>技術的回答</w:t>
-      </w:r>
-    </w:p>
-    <w:p/>
-    <w:p>
-      <w:r>
-        <w:rPr>
-          <w:rFonts w:ascii="Noto Sans CJK JP" w:hAnsi="Noto Sans CJK JP" w:eastAsia="Noto Sans CJK JP"/>
-          <w:sz w:val="21"/>
-        </w:rPr>
-        <w:t>保険金が支払われる場合に、受取口座の名義、番号、金融機関情報などを確認することです。</w:t>
-      </w:r>
-    </w:p>
-    <w:p/>
-    <w:p>
-      <w:pPr>
-        <w:pStyle w:val="Heading2"/>
-      </w:pPr>
-      <w:r>
-        <w:rPr>
-          <w:rFonts w:ascii="Noto Sans CJK JP" w:hAnsi="Noto Sans CJK JP" w:eastAsia="Noto Sans CJK JP"/>
-          <w:b/>
-          <w:color w:val="2F5496"/>
-          <w:sz w:val="28"/>
-        </w:rPr>
-        <w:t>ブラジル人顧客への回答</w:t>
-      </w:r>
-    </w:p>
-    <w:p/>
-    <w:p>
-      <w:pPr>
-        <w:pStyle w:val="Heading3"/>
-      </w:pPr>
-      <w:r>
-        <w:rPr>
-          <w:rFonts w:ascii="Noto Sans CJK JP" w:hAnsi="Noto Sans CJK JP" w:eastAsia="Noto Sans CJK JP"/>
-          <w:b/>
-          <w:color w:val="595959"/>
-          <w:sz w:val="24"/>
-        </w:rPr>
-        <w:t>ポルトガル語で伝える内容</w:t>
-      </w:r>
-    </w:p>
-    <w:p/>
-    <w:p>
-      <w:r>
-        <w:rPr>
-          <w:rFonts w:ascii="Noto Sans CJK JP" w:hAnsi="Noto Sans CJK JP" w:eastAsia="Noto Sans CJK JP"/>
-          <w:sz w:val="21"/>
-        </w:rPr>
-        <w:t>Os dados bancários precisam estar corretos para evitar atraso no pagamento.</w:t>
-      </w:r>
-    </w:p>
-    <w:p/>
-    <w:p>
-      <w:pPr>
-        <w:pStyle w:val="Heading3"/>
-      </w:pPr>
-      <w:r>
-        <w:rPr>
-          <w:rFonts w:ascii="Noto Sans CJK JP" w:hAnsi="Noto Sans CJK JP" w:eastAsia="Noto Sans CJK JP"/>
-          <w:b/>
-          <w:color w:val="595959"/>
-          <w:sz w:val="24"/>
-        </w:rPr>
-        <w:t>カタカナ読み</w:t>
-      </w:r>
-    </w:p>
-    <w:p/>
-    <w:p>
-      <w:r>
-        <w:rPr>
-          <w:rFonts w:ascii="Noto Sans CJK JP" w:hAnsi="Noto Sans CJK JP" w:eastAsia="Noto Sans CJK JP"/>
-          <w:sz w:val="21"/>
-        </w:rPr>
-        <w:t>オス ダドス バンカリオス プレシザン エスタール コヘトス パラ エヴィタール アトラゾ ノ パガメント</w:t>
-      </w:r>
-    </w:p>
-    <w:p/>
-    <w:p>
-      <w:r>
-        <w:rPr>
-          <w:rFonts w:ascii="Noto Sans CJK JP" w:hAnsi="Noto Sans CJK JP" w:eastAsia="Noto Sans CJK JP"/>
-          <w:sz w:val="21"/>
-        </w:rPr>
-        <w:t>日本語確認用: 口座情報は支払い前に正確に確認する。</w:t>
+        <w:t>日本語確認用: 支払いが承認された場合に備えて、口座情報を正確に確認する。</w:t>
       </w:r>
     </w:p>
     <w:p/>

</xml_diff>